<commit_message>
Thêm công thức diện tích, chu vi và trang tính toán
Co-Authored-By: Claude Opus 5.5 <noreply@anthropic.com>
Claude-Session: https://claude.ai/code/session_019GPt2YzaMnuKWQr3TmCixm
</commit_message>
<xml_diff>
--- a/docs/2_Huong_dan_su_dung.docx
+++ b/docs/2_Huong_dan_su_dung.docx
@@ -1271,7 +1271,7 @@
           <w:sz w:val="19"/>
           <w:szCs w:val="19"/>
         </w:rPr>
-        <w:t xml:space="preserve">  - Nút DauHieu : 26</w:t>
+        <w:t xml:space="preserve">  - Nút CongThuc : 68</w:t>
       </w:r>
     </w:p>
     <w:p>
@@ -1286,7 +1286,7 @@
           <w:sz w:val="19"/>
           <w:szCs w:val="19"/>
         </w:rPr>
-        <w:t xml:space="preserve">  - Nút Hinh    : 9</w:t>
+        <w:t xml:space="preserve">  - Nút DaiLuong : 71</w:t>
       </w:r>
     </w:p>
     <w:p>
@@ -1301,7 +1301,7 @@
           <w:sz w:val="19"/>
           <w:szCs w:val="19"/>
         </w:rPr>
-        <w:t xml:space="preserve">  - Nút TinhChat: 17</w:t>
+        <w:t xml:space="preserve">  - Nút DauHieu : 26</w:t>
       </w:r>
     </w:p>
     <w:p>
@@ -1316,7 +1316,7 @@
           <w:sz w:val="19"/>
           <w:szCs w:val="19"/>
         </w:rPr>
-        <w:t xml:space="preserve">  - Quan hệ AP_DUNG_CHO  : 26</w:t>
+        <w:t xml:space="preserve">  - Nút Hinh    : 9</w:t>
       </w:r>
     </w:p>
     <w:p>
@@ -1331,7 +1331,7 @@
           <w:sz w:val="19"/>
           <w:szCs w:val="19"/>
         </w:rPr>
-        <w:t xml:space="preserve">  - Quan hệ CAN          : 27</w:t>
+        <w:t xml:space="preserve">  - Nút TinhChat: 17</w:t>
       </w:r>
     </w:p>
     <w:p>
@@ -1346,7 +1346,7 @@
           <w:sz w:val="19"/>
           <w:szCs w:val="19"/>
         </w:rPr>
-        <w:t xml:space="preserve">  - Quan hệ CO_TINH_CHAT : 17</w:t>
+        <w:t xml:space="preserve">  - Quan hệ AP_DUNG_CHO  : 26</w:t>
       </w:r>
     </w:p>
     <w:p>
@@ -1361,7 +1361,7 @@
           <w:sz w:val="19"/>
           <w:szCs w:val="19"/>
         </w:rPr>
-        <w:t xml:space="preserve">  - Quan hệ KET_LUAN     : 25</w:t>
+        <w:t xml:space="preserve">  - Quan hệ CAN          : 27</w:t>
       </w:r>
     </w:p>
     <w:p>
@@ -1376,7 +1376,97 @@
           <w:sz w:val="19"/>
           <w:szCs w:val="19"/>
         </w:rPr>
+        <w:t xml:space="preserve">  - Quan hệ CAN_BIEN     : 149</w:t>
+      </w:r>
+    </w:p>
+    <w:p>
+      <w:pPr>
+        <w:shd w:fill="F2F4F7" w:color="auto" w:val="clear"/>
+        <w:spacing w:after="0" w:before="0" w:line="260"/>
+        <w:ind w:left="200" w:right="200"/>
+      </w:pPr>
+      <w:r>
+        <w:rPr>
+          <w:rFonts w:ascii="Consolas" w:cs="Consolas" w:eastAsia="Consolas" w:hAnsi="Consolas"/>
+          <w:sz w:val="19"/>
+          <w:szCs w:val="19"/>
+        </w:rPr>
+        <w:t xml:space="preserve">  - Quan hệ CO_CONG_THUC : 68</w:t>
+      </w:r>
+    </w:p>
+    <w:p>
+      <w:pPr>
+        <w:shd w:fill="F2F4F7" w:color="auto" w:val="clear"/>
+        <w:spacing w:after="0" w:before="0" w:line="260"/>
+        <w:ind w:left="200" w:right="200"/>
+      </w:pPr>
+      <w:r>
+        <w:rPr>
+          <w:rFonts w:ascii="Consolas" w:cs="Consolas" w:eastAsia="Consolas" w:hAnsi="Consolas"/>
+          <w:sz w:val="19"/>
+          <w:szCs w:val="19"/>
+        </w:rPr>
+        <w:t xml:space="preserve">  - Quan hệ CO_DAI_LUONG : 71</w:t>
+      </w:r>
+    </w:p>
+    <w:p>
+      <w:pPr>
+        <w:shd w:fill="F2F4F7" w:color="auto" w:val="clear"/>
+        <w:spacing w:after="0" w:before="0" w:line="260"/>
+        <w:ind w:left="200" w:right="200"/>
+      </w:pPr>
+      <w:r>
+        <w:rPr>
+          <w:rFonts w:ascii="Consolas" w:cs="Consolas" w:eastAsia="Consolas" w:hAnsi="Consolas"/>
+          <w:sz w:val="19"/>
+          <w:szCs w:val="19"/>
+        </w:rPr>
+        <w:t xml:space="preserve">  - Quan hệ CO_TINH_CHAT : 17</w:t>
+      </w:r>
+    </w:p>
+    <w:p>
+      <w:pPr>
+        <w:shd w:fill="F2F4F7" w:color="auto" w:val="clear"/>
+        <w:spacing w:after="0" w:before="0" w:line="260"/>
+        <w:ind w:left="200" w:right="200"/>
+      </w:pPr>
+      <w:r>
+        <w:rPr>
+          <w:rFonts w:ascii="Consolas" w:cs="Consolas" w:eastAsia="Consolas" w:hAnsi="Consolas"/>
+          <w:sz w:val="19"/>
+          <w:szCs w:val="19"/>
+        </w:rPr>
+        <w:t xml:space="preserve">  - Quan hệ KET_LUAN     : 25</w:t>
+      </w:r>
+    </w:p>
+    <w:p>
+      <w:pPr>
+        <w:shd w:fill="F2F4F7" w:color="auto" w:val="clear"/>
+        <w:spacing w:after="0" w:before="0" w:line="260"/>
+        <w:ind w:left="200" w:right="200"/>
+      </w:pPr>
+      <w:r>
+        <w:rPr>
+          <w:rFonts w:ascii="Consolas" w:cs="Consolas" w:eastAsia="Consolas" w:hAnsi="Consolas"/>
+          <w:sz w:val="19"/>
+          <w:szCs w:val="19"/>
+        </w:rPr>
         <w:t xml:space="preserve">  - Quan hệ LA_MOT       : 12</w:t>
+      </w:r>
+    </w:p>
+    <w:p>
+      <w:pPr>
+        <w:shd w:fill="F2F4F7" w:color="auto" w:val="clear"/>
+        <w:spacing w:after="0" w:before="0" w:line="260"/>
+        <w:ind w:left="200" w:right="200"/>
+      </w:pPr>
+      <w:r>
+        <w:rPr>
+          <w:rFonts w:ascii="Consolas" w:cs="Consolas" w:eastAsia="Consolas" w:hAnsi="Consolas"/>
+          <w:sz w:val="19"/>
+          <w:szCs w:val="19"/>
+        </w:rPr>
+        <w:t xml:space="preserve">  - Quan hệ MAU_THUAN    : 5</w:t>
       </w:r>
     </w:p>
     <w:p>
@@ -1394,7 +1484,7 @@
           <w:sz w:val="19"/>
           <w:szCs w:val="19"/>
         </w:rPr>
-        <w:t xml:space="preserve">  - Quan hệ MAU_THUAN    : 5</w:t>
+        <w:t xml:space="preserve">  - Quan hệ TINH_RA      : 68</w:t>
       </w:r>
     </w:p>
     <w:p>
@@ -2190,7 +2280,7 @@
           <w:sz w:val="26"/>
           <w:szCs w:val="26"/>
         </w:rPr>
-        <w:t xml:space="preserve">Cuối trang kết quả có mục “Các câu Cypher đã chạy trên Neo4j”. Bấm vào để mở ra. Mục này liệt kê từng loại truy vấn và số lần chạy, giúp thấy rõ toàn bộ việc suy luận được thực hiện trên Neo4j.</w:t>
+        <w:t xml:space="preserve">Khi kết luận được một hình cụ thể, trang kết quả hiện thêm mục “Công thức của …” gồm công thức diện tích, chu vi và công thức liên quan của hình đó. Bấm “Nhập số liệu để tính ⟶” để chuyển sang trang tính toán (mục 4).</w:t>
       </w:r>
     </w:p>
     <w:p>
@@ -2201,9 +2291,9 @@
       <w:r>
         <w:drawing>
           <wp:inline distT="0" distB="0" distL="0" distR="0">
-            <wp:extent cx="4953000" cy="4305300"/>
+            <wp:extent cx="4953000" cy="1847850"/>
             <wp:effectExtent t="0" r="0" b="0" l="0"/>
-            <wp:docPr id="1" name="07_cypher_da_chay.png" descr="Các câu Cypher mà bộ suy luận đã gửi tới Neo4j" title="Các câu Cypher mà bộ suy luận đã gửi tới Neo4j"/>
+            <wp:docPr id="1" name="16_cong_thuc_sau_nhan_dang.png" descr="Công thức của hình vừa nhận dạng được" title="Công thức của hình vừa nhận dạng được"/>
             <wp:cNvGraphicFramePr>
               <a:graphicFrameLocks xmlns:a="http://schemas.openxmlformats.org/drawingml/2006/main" noChangeAspect="1"/>
             </wp:cNvGraphicFramePr>
@@ -2226,7 +2316,7 @@
                   <pic:spPr bwMode="auto">
                     <a:xfrm>
                       <a:off x="0" y="0"/>
-                      <a:ext cx="4953000" cy="4305300"/>
+                      <a:ext cx="4953000" cy="1847850"/>
                     </a:xfrm>
                     <a:prstGeom prst="rect">
                       <a:avLst/>
@@ -2252,19 +2342,7 @@
           <w:sz w:val="22"/>
           <w:szCs w:val="22"/>
         </w:rPr>
-        <w:t xml:space="preserve">Hình 7. Các câu Cypher mà bộ suy luận đã gửi tới Neo4j</w:t>
-      </w:r>
-    </w:p>
-    <w:p>
-      <w:pPr>
-        <w:pStyle w:val="Heading1"/>
-        <w:spacing w:after="160" w:before="360"/>
-      </w:pPr>
-      <w:r>
-        <w:rPr>
-          <w:rFonts w:ascii="Times New Roman" w:cs="Times New Roman" w:eastAsia="Times New Roman" w:hAnsi="Times New Roman"/>
-        </w:rPr>
-        <w:t xml:space="preserve">4. Bài toán mẫu</w:t>
+        <w:t xml:space="preserve">Hình 7. Công thức của hình vừa nhận dạng được</w:t>
       </w:r>
     </w:p>
     <w:p>
@@ -2278,7 +2356,7 @@
           <w:sz w:val="26"/>
           <w:szCs w:val="26"/>
         </w:rPr>
-        <w:t xml:space="preserve">Tab Bài toán mẫu liệt kê 10 bài toán kèm kết luận do hệ thống tự giải. Bấm “Xem lời giải” để mở bài đó ở trang Nhận dạng với giả thiết đã được chọn sẵn.</w:t>
+        <w:t xml:space="preserve">Cuối trang kết quả có mục “Các câu Cypher đã chạy trên Neo4j”. Bấm vào để mở ra. Mục này liệt kê từng loại truy vấn và số lần chạy, giúp thấy rõ toàn bộ việc suy luận được thực hiện trên Neo4j.</w:t>
       </w:r>
     </w:p>
     <w:p>
@@ -2289,9 +2367,9 @@
       <w:r>
         <w:drawing>
           <wp:inline distT="0" distB="0" distL="0" distR="0">
-            <wp:extent cx="5715000" cy="3810000"/>
+            <wp:extent cx="4953000" cy="4305300"/>
             <wp:effectExtent t="0" r="0" b="0" l="0"/>
-            <wp:docPr id="1" name="08_bai_toan_mau.png" descr="Trang Bài toán mẫu" title="Trang Bài toán mẫu"/>
+            <wp:docPr id="1" name="07_cypher_da_chay.png" descr="Các câu Cypher mà bộ suy luận đã gửi tới Neo4j" title="Các câu Cypher mà bộ suy luận đã gửi tới Neo4j"/>
             <wp:cNvGraphicFramePr>
               <a:graphicFrameLocks xmlns:a="http://schemas.openxmlformats.org/drawingml/2006/main" noChangeAspect="1"/>
             </wp:cNvGraphicFramePr>
@@ -2314,7 +2392,7 @@
                   <pic:spPr bwMode="auto">
                     <a:xfrm>
                       <a:off x="0" y="0"/>
-                      <a:ext cx="5715000" cy="3810000"/>
+                      <a:ext cx="4953000" cy="4305300"/>
                     </a:xfrm>
                     <a:prstGeom prst="rect">
                       <a:avLst/>
@@ -2340,7 +2418,7 @@
           <w:sz w:val="22"/>
           <w:szCs w:val="22"/>
         </w:rPr>
-        <w:t xml:space="preserve">Hình 8. Trang Bài toán mẫu</w:t>
+        <w:t xml:space="preserve">Hình 8. Các câu Cypher mà bộ suy luận đã gửi tới Neo4j</w:t>
       </w:r>
     </w:p>
     <w:p>
@@ -2352,7 +2430,7 @@
         <w:rPr>
           <w:rFonts w:ascii="Times New Roman" w:cs="Times New Roman" w:eastAsia="Times New Roman" w:hAnsi="Times New Roman"/>
         </w:rPr>
-        <w:t xml:space="preserve">5. Đồ thị tri thức và tra cứu</w:t>
+        <w:t xml:space="preserve">4. Tính diện tích, chu vi và các đại lượng liên quan</w:t>
       </w:r>
     </w:p>
     <w:p>
@@ -2366,7 +2444,177 @@
           <w:sz w:val="26"/>
           <w:szCs w:val="26"/>
         </w:rPr>
-        <w:t xml:space="preserve">Tab Đồ thị tri thức cho biết số nút và số quan hệ đang có trong Neo4j, sơ đồ phân cấp, lược đồ đồ thị, bảng toàn bộ dấu hiệu nhận biết và các câu truy vấn mẫu để chạy trong Neo4j Browser.</w:t>
+        <w:t xml:space="preserve">Bấm tab “Tính diện tích, chu vi” trên thanh menu.</w:t>
+      </w:r>
+    </w:p>
+    <w:p>
+      <w:pPr>
+        <w:pStyle w:val="ListParagraph"/>
+        <w:numPr>
+          <w:ilvl w:val="0"/>
+          <w:numId w:val="3"/>
+        </w:numPr>
+        <w:spacing w:after="60" w:line="300"/>
+      </w:pPr>
+      <w:r>
+        <w:rPr>
+          <w:rFonts w:ascii="Times New Roman" w:cs="Times New Roman" w:eastAsia="Times New Roman" w:hAnsi="Times New Roman"/>
+          <w:sz w:val="26"/>
+          <w:szCs w:val="26"/>
+        </w:rPr>
+        <w:t xml:space="preserve">Ở ô </w:t>
+      </w:r>
+      <w:r>
+        <w:rPr>
+          <w:rFonts w:ascii="Times New Roman" w:cs="Times New Roman" w:eastAsia="Times New Roman" w:hAnsi="Times New Roman"/>
+          <w:b/>
+          <w:bCs/>
+          <w:sz w:val="26"/>
+          <w:szCs w:val="26"/>
+        </w:rPr>
+        <w:t xml:space="preserve">Loại hình</w:t>
+      </w:r>
+      <w:r>
+        <w:rPr>
+          <w:rFonts w:ascii="Times New Roman" w:cs="Times New Roman" w:eastAsia="Times New Roman" w:hAnsi="Times New Roman"/>
+          <w:sz w:val="26"/>
+          <w:szCs w:val="26"/>
+        </w:rPr>
+        <w:t xml:space="preserve">, chọn hình cần tính. Hình vẽ minh hoạ bên dưới cho biết ý nghĩa từng ký hiệu (a, b, h, d₁, α…).</w:t>
+      </w:r>
+    </w:p>
+    <w:p>
+      <w:pPr>
+        <w:pStyle w:val="ListParagraph"/>
+        <w:numPr>
+          <w:ilvl w:val="0"/>
+          <w:numId w:val="3"/>
+        </w:numPr>
+        <w:spacing w:after="60" w:line="300"/>
+      </w:pPr>
+      <w:r>
+        <w:rPr>
+          <w:rFonts w:ascii="Times New Roman" w:cs="Times New Roman" w:eastAsia="Times New Roman" w:hAnsi="Times New Roman"/>
+          <w:sz w:val="26"/>
+          <w:szCs w:val="26"/>
+        </w:rPr>
+        <w:t xml:space="preserve">Nhập các số liệu đã biết vào ô tương ứng; ô nào chưa biết thì để trống. Có thể gõ số thập phân bằng dấu chấm hoặc dấu phẩy (4,5 hoặc 4.5). Góc nhập theo độ.</w:t>
+      </w:r>
+    </w:p>
+    <w:p>
+      <w:pPr>
+        <w:pStyle w:val="ListParagraph"/>
+        <w:numPr>
+          <w:ilvl w:val="0"/>
+          <w:numId w:val="3"/>
+        </w:numPr>
+        <w:spacing w:after="60" w:line="300"/>
+      </w:pPr>
+      <w:r>
+        <w:rPr>
+          <w:rFonts w:ascii="Times New Roman" w:cs="Times New Roman" w:eastAsia="Times New Roman" w:hAnsi="Times New Roman"/>
+          <w:sz w:val="26"/>
+          <w:szCs w:val="26"/>
+        </w:rPr>
+        <w:t xml:space="preserve">Chọn đơn vị độ dài (mm, cm, dm, m, km) nếu muốn kết quả ghi kèm đơn vị. Diện tích tự động có đơn vị bình phương.</w:t>
+      </w:r>
+    </w:p>
+    <w:p>
+      <w:pPr>
+        <w:pStyle w:val="ListParagraph"/>
+        <w:numPr>
+          <w:ilvl w:val="0"/>
+          <w:numId w:val="3"/>
+        </w:numPr>
+        <w:spacing w:after="60" w:line="300"/>
+      </w:pPr>
+      <w:r>
+        <w:rPr>
+          <w:rFonts w:ascii="Times New Roman" w:cs="Times New Roman" w:eastAsia="Times New Roman" w:hAnsi="Times New Roman"/>
+          <w:sz w:val="26"/>
+          <w:szCs w:val="26"/>
+        </w:rPr>
+        <w:t xml:space="preserve">Bấm </w:t>
+      </w:r>
+      <w:r>
+        <w:rPr>
+          <w:rFonts w:ascii="Times New Roman" w:cs="Times New Roman" w:eastAsia="Times New Roman" w:hAnsi="Times New Roman"/>
+          <w:b/>
+          <w:bCs/>
+          <w:sz w:val="26"/>
+          <w:szCs w:val="26"/>
+        </w:rPr>
+        <w:t xml:space="preserve">Tính ⟶</w:t>
+      </w:r>
+      <w:r>
+        <w:rPr>
+          <w:rFonts w:ascii="Times New Roman" w:cs="Times New Roman" w:eastAsia="Times New Roman" w:hAnsi="Times New Roman"/>
+          <w:sz w:val="26"/>
+          <w:szCs w:val="26"/>
+        </w:rPr>
+        <w:t xml:space="preserve">. Bấm </w:t>
+      </w:r>
+      <w:r>
+        <w:rPr>
+          <w:rFonts w:ascii="Times New Roman" w:cs="Times New Roman" w:eastAsia="Times New Roman" w:hAnsi="Times New Roman"/>
+          <w:b/>
+          <w:bCs/>
+          <w:sz w:val="26"/>
+          <w:szCs w:val="26"/>
+        </w:rPr>
+        <w:t xml:space="preserve">Điền ví dụ</w:t>
+      </w:r>
+      <w:r>
+        <w:rPr>
+          <w:rFonts w:ascii="Times New Roman" w:cs="Times New Roman" w:eastAsia="Times New Roman" w:hAnsi="Times New Roman"/>
+          <w:sz w:val="26"/>
+          <w:szCs w:val="26"/>
+        </w:rPr>
+        <w:t xml:space="preserve"> để thử nhanh với số liệu mẫu, hoặc </w:t>
+      </w:r>
+      <w:r>
+        <w:rPr>
+          <w:rFonts w:ascii="Times New Roman" w:cs="Times New Roman" w:eastAsia="Times New Roman" w:hAnsi="Times New Roman"/>
+          <w:b/>
+          <w:bCs/>
+          <w:sz w:val="26"/>
+          <w:szCs w:val="26"/>
+        </w:rPr>
+        <w:t xml:space="preserve">Xoá</w:t>
+      </w:r>
+      <w:r>
+        <w:rPr>
+          <w:rFonts w:ascii="Times New Roman" w:cs="Times New Roman" w:eastAsia="Times New Roman" w:hAnsi="Times New Roman"/>
+          <w:sz w:val="26"/>
+          <w:szCs w:val="26"/>
+        </w:rPr>
+        <w:t xml:space="preserve"> để nhập lại.</w:t>
+      </w:r>
+    </w:p>
+    <w:p>
+      <w:pPr>
+        <w:spacing w:after="120" w:line="312"/>
+        <w:jc w:val="both"/>
+      </w:pPr>
+      <w:r>
+        <w:rPr>
+          <w:rFonts w:ascii="Times New Roman" w:cs="Times New Roman" w:eastAsia="Times New Roman" w:hAnsi="Times New Roman"/>
+          <w:sz w:val="26"/>
+          <w:szCs w:val="26"/>
+        </w:rPr>
+        <w:t xml:space="preserve">Kết quả gồm bốn phần: ô Diện tích và Chu vi, bảng mọi đại lượng tính được (kèm công thức đã dùng), lời giải từng bước, và danh sách công thức của hình. Nếu chưa đủ dữ kiện để tính S hoặc P, ô tương ứng ghi “chưa tính được” và cho biết cần biết thêm những đại lượng nào.</w:t>
+      </w:r>
+    </w:p>
+    <w:p>
+      <w:pPr>
+        <w:pStyle w:val="Heading2"/>
+        <w:spacing w:after="120" w:before="240"/>
+      </w:pPr>
+      <w:r>
+        <w:rPr>
+          <w:rFonts w:ascii="Times New Roman" w:cs="Times New Roman" w:eastAsia="Times New Roman" w:hAnsi="Times New Roman"/>
+        </w:rPr>
+        <w:t xml:space="preserve">4.1. Ví dụ: Hình chữ nhật có chiều dài 4 cm, chiều rộng 3 cm</w:t>
       </w:r>
     </w:p>
     <w:p>
@@ -2377,9 +2625,9 @@
       <w:r>
         <w:drawing>
           <wp:inline distT="0" distB="0" distL="0" distR="0">
-            <wp:extent cx="5715000" cy="4933950"/>
+            <wp:extent cx="5334000" cy="5924550"/>
             <wp:effectExtent t="0" r="0" b="0" l="0"/>
-            <wp:docPr id="1" name="09a_do_thi_so_do.png" descr="Thống kê đồ thị và sơ đồ phân cấp" title="Thống kê đồ thị và sơ đồ phân cấp"/>
+            <wp:docPr id="1" name="12_tinh_toan_chu_nhat.png" descr="Hình chữ nhật: S = 12 cm², P = 14 cm, đường chéo d = 5 cm" title="Hình chữ nhật: S = 12 cm², P = 14 cm, đường chéo d = 5 cm"/>
             <wp:cNvGraphicFramePr>
               <a:graphicFrameLocks xmlns:a="http://schemas.openxmlformats.org/drawingml/2006/main" noChangeAspect="1"/>
             </wp:cNvGraphicFramePr>
@@ -2402,7 +2650,7 @@
                   <pic:spPr bwMode="auto">
                     <a:xfrm>
                       <a:off x="0" y="0"/>
-                      <a:ext cx="5715000" cy="4933950"/>
+                      <a:ext cx="5334000" cy="5924550"/>
                     </a:xfrm>
                     <a:prstGeom prst="rect">
                       <a:avLst/>
@@ -2428,7 +2676,33 @@
           <w:sz w:val="22"/>
           <w:szCs w:val="22"/>
         </w:rPr>
-        <w:t xml:space="preserve">Hình 9. Thống kê đồ thị và sơ đồ phân cấp</w:t>
+        <w:t xml:space="preserve">Hình 9. Hình chữ nhật: S = 12 cm², P = 14 cm, đường chéo d = 5 cm</w:t>
+      </w:r>
+    </w:p>
+    <w:p>
+      <w:pPr>
+        <w:pStyle w:val="Heading2"/>
+        <w:spacing w:after="120" w:before="240"/>
+      </w:pPr>
+      <w:r>
+        <w:rPr>
+          <w:rFonts w:ascii="Times New Roman" w:cs="Times New Roman" w:eastAsia="Times New Roman" w:hAnsi="Times New Roman"/>
+        </w:rPr>
+        <w:t xml:space="preserve">4.2. Ví dụ: Hình thoi có hai đường chéo 6 cm và 8 cm</w:t>
+      </w:r>
+    </w:p>
+    <w:p>
+      <w:pPr>
+        <w:spacing w:after="120" w:line="312"/>
+        <w:jc w:val="both"/>
+      </w:pPr>
+      <w:r>
+        <w:rPr>
+          <w:rFonts w:ascii="Times New Roman" w:cs="Times New Roman" w:eastAsia="Times New Roman" w:hAnsi="Times New Roman"/>
+          <w:sz w:val="26"/>
+          <w:szCs w:val="26"/>
+        </w:rPr>
+        <w:t xml:space="preserve">Chỉ cần nhập d₁ = 6 và d₂ = 8. Hệ thống tính ra cạnh a = 5 cm, S = 24 cm², P = 20 cm, góc α, chiều cao h = 4,8 cm và bán kính đường tròn nội tiếp r = 2,4 cm.</w:t>
       </w:r>
     </w:p>
     <w:p>
@@ -2439,9 +2713,9 @@
       <w:r>
         <w:drawing>
           <wp:inline distT="0" distB="0" distL="0" distR="0">
-            <wp:extent cx="4695825" cy="7620000"/>
+            <wp:extent cx="5715000" cy="3762375"/>
             <wp:effectExtent t="0" r="0" b="0" l="0"/>
-            <wp:docPr id="1" name="09b_do_thi_dau_hieu.png" descr="Bảng dấu hiệu nhận biết và truy vấn mẫu" title="Bảng dấu hiệu nhận biết và truy vấn mẫu"/>
+            <wp:docPr id="1" name="13_tinh_toan_hinh_thoi.png" descr="Hình thoi tính từ hai đường chéo" title="Hình thoi tính từ hai đường chéo"/>
             <wp:cNvGraphicFramePr>
               <a:graphicFrameLocks xmlns:a="http://schemas.openxmlformats.org/drawingml/2006/main" noChangeAspect="1"/>
             </wp:cNvGraphicFramePr>
@@ -2464,7 +2738,7 @@
                   <pic:spPr bwMode="auto">
                     <a:xfrm>
                       <a:off x="0" y="0"/>
-                      <a:ext cx="4695825" cy="7620000"/>
+                      <a:ext cx="5715000" cy="3762375"/>
                     </a:xfrm>
                     <a:prstGeom prst="rect">
                       <a:avLst/>
@@ -2490,7 +2764,19 @@
           <w:sz w:val="22"/>
           <w:szCs w:val="22"/>
         </w:rPr>
-        <w:t xml:space="preserve">Hình 10. Bảng dấu hiệu nhận biết và truy vấn mẫu</w:t>
+        <w:t xml:space="preserve">Hình 10. Hình thoi tính từ hai đường chéo</w:t>
+      </w:r>
+    </w:p>
+    <w:p>
+      <w:pPr>
+        <w:pStyle w:val="Heading2"/>
+        <w:spacing w:after="120" w:before="240"/>
+      </w:pPr>
+      <w:r>
+        <w:rPr>
+          <w:rFonts w:ascii="Times New Roman" w:cs="Times New Roman" w:eastAsia="Times New Roman" w:hAnsi="Times New Roman"/>
+        </w:rPr>
+        <w:t xml:space="preserve">4.3. Số liệu không nhất quán</w:t>
       </w:r>
     </w:p>
     <w:p>
@@ -2504,7 +2790,7 @@
           <w:sz w:val="26"/>
           <w:szCs w:val="26"/>
         </w:rPr>
-        <w:t xml:space="preserve">Bấm vào một hình trên sơ đồ để mở trang tra cứu hình đó. Trang tra cứu có định nghĩa, hình cha và hình con, các dấu hiệu nhận biết, những hình có thể suy ra tiếp, và toàn bộ tính chất (tính chất riêng được in đậm, còn lại ghi rõ kế thừa từ hình nào).</w:t>
+        <w:t xml:space="preserve">Nếu các số liệu nhập vào mâu thuẫn nhau, ví dụ hình vuông có cạnh a = 5 nhưng lại nhập diện tích S = 30, hệ thống vẫn tính nhưng hiện cảnh báo màu đỏ, chỉ rõ công thức nào cho kết quả khác với số đã nhập.</w:t>
       </w:r>
     </w:p>
     <w:p>
@@ -2515,9 +2801,9 @@
       <w:r>
         <w:drawing>
           <wp:inline distT="0" distB="0" distL="0" distR="0">
-            <wp:extent cx="5715000" cy="5086350"/>
+            <wp:extent cx="5715000" cy="3762375"/>
             <wp:effectExtent t="0" r="0" b="0" l="0"/>
-            <wp:docPr id="1" name="10_tra_cuu_hinh_vuong.png" descr="Trang tra cứu Hình vuông" title="Trang tra cứu Hình vuông"/>
+            <wp:docPr id="1" name="14_tinh_toan_khong_nhat_quan.png" descr="Cảnh báo số liệu không nhất quán" title="Cảnh báo số liệu không nhất quán"/>
             <wp:cNvGraphicFramePr>
               <a:graphicFrameLocks xmlns:a="http://schemas.openxmlformats.org/drawingml/2006/main" noChangeAspect="1"/>
             </wp:cNvGraphicFramePr>
@@ -2540,7 +2826,7 @@
                   <pic:spPr bwMode="auto">
                     <a:xfrm>
                       <a:off x="0" y="0"/>
-                      <a:ext cx="5715000" cy="5086350"/>
+                      <a:ext cx="5715000" cy="3762375"/>
                     </a:xfrm>
                     <a:prstGeom prst="rect">
                       <a:avLst/>
@@ -2566,7 +2852,21 @@
           <w:sz w:val="22"/>
           <w:szCs w:val="22"/>
         </w:rPr>
-        <w:t xml:space="preserve">Hình 11. Trang tra cứu Hình vuông</w:t>
+        <w:t xml:space="preserve">Hình 11. Cảnh báo số liệu không nhất quán</w:t>
+      </w:r>
+    </w:p>
+    <w:p>
+      <w:pPr>
+        <w:spacing w:after="120" w:line="312"/>
+        <w:jc w:val="both"/>
+      </w:pPr>
+      <w:r>
+        <w:rPr>
+          <w:rFonts w:ascii="Times New Roman" w:cs="Times New Roman" w:eastAsia="Times New Roman" w:hAnsi="Times New Roman"/>
+          <w:sz w:val="26"/>
+          <w:szCs w:val="26"/>
+        </w:rPr>
+        <w:t xml:space="preserve">Số âm, số 0 hoặc góc ngoài khoảng 0°–180° sẽ bị báo “Dữ liệu không hợp lệ”. Công thức không áp dụng được với số liệu đã nhập (ví dụ cạnh bên quá ngắn so với hiệu hai đáy) được liệt kê trong mục “Công thức không áp dụng được”.</w:t>
       </w:r>
     </w:p>
     <w:p>
@@ -2578,19 +2878,7 @@
         <w:rPr>
           <w:rFonts w:ascii="Times New Roman" w:cs="Times New Roman" w:eastAsia="Times New Roman" w:hAnsi="Times New Roman"/>
         </w:rPr>
-        <w:t xml:space="preserve">6. Dùng trực tiếp trong Neo4j Browser và qua API</w:t>
-      </w:r>
-    </w:p>
-    <w:p>
-      <w:pPr>
-        <w:pStyle w:val="Heading2"/>
-        <w:spacing w:after="120" w:before="240"/>
-      </w:pPr>
-      <w:r>
-        <w:rPr>
-          <w:rFonts w:ascii="Times New Roman" w:cs="Times New Roman" w:eastAsia="Times New Roman" w:hAnsi="Times New Roman"/>
-        </w:rPr>
-        <w:t xml:space="preserve">6.1. Neo4j Browser</w:t>
+        <w:t xml:space="preserve">5. Bài toán mẫu</w:t>
       </w:r>
     </w:p>
     <w:p>
@@ -2604,237 +2892,8 @@
           <w:sz w:val="26"/>
           <w:szCs w:val="26"/>
         </w:rPr>
-        <w:t xml:space="preserve">Mở </w:t>
-      </w:r>
-      <w:r>
-        <w:rPr>
-          <w:rFonts w:ascii="Times New Roman" w:cs="Times New Roman" w:eastAsia="Times New Roman" w:hAnsi="Times New Roman"/>
-          <w:b/>
-          <w:bCs/>
-          <w:sz w:val="26"/>
-          <w:szCs w:val="26"/>
-        </w:rPr>
-        <w:t xml:space="preserve">http://localhost:7474</w:t>
-      </w:r>
-      <w:r>
-        <w:rPr>
-          <w:rFonts w:ascii="Times New Roman" w:cs="Times New Roman" w:eastAsia="Times New Roman" w:hAnsi="Times New Roman"/>
-          <w:sz w:val="26"/>
-          <w:szCs w:val="26"/>
-        </w:rPr>
-        <w:t xml:space="preserve"> và đăng nhập bằng neo4j / matkhau123. Gõ câu lệnh vào ô ở trên cùng rồi nhấn Ctrl + Enter. Ví dụ, xem sơ đồ phân cấp:</w:t>
-      </w:r>
-    </w:p>
-    <w:p>
-      <w:pPr>
-        <w:pBdr>
-          <w:top w:val="single" w:color="D0D5DD" w:sz="4" w:space="4"/>
-        </w:pBdr>
-        <w:shd w:fill="F2F4F7" w:color="auto" w:val="clear"/>
-        <w:spacing w:after="0" w:before="0" w:line="260"/>
-        <w:ind w:left="200" w:right="200"/>
-      </w:pPr>
-      <w:r>
-        <w:rPr>
-          <w:rFonts w:ascii="Consolas" w:cs="Consolas" w:eastAsia="Consolas" w:hAnsi="Consolas"/>
-          <w:sz w:val="19"/>
-          <w:szCs w:val="19"/>
-        </w:rPr>
-        <w:t xml:space="preserve">MATCH p = (:Hinh)-[:LA_MOT]-&gt;(:Hinh) RETURN p</w:t>
-      </w:r>
-    </w:p>
-    <w:p>
-      <w:pPr>
-        <w:spacing w:after="80"/>
-      </w:pPr>
-    </w:p>
-    <w:p>
-      <w:pPr>
-        <w:spacing w:after="120" w:line="312"/>
-        <w:jc w:val="both"/>
-      </w:pPr>
-      <w:r>
-        <w:rPr>
-          <w:rFonts w:ascii="Times New Roman" w:cs="Times New Roman" w:eastAsia="Times New Roman" w:hAnsi="Times New Roman"/>
-          <w:sz w:val="26"/>
-          <w:szCs w:val="26"/>
-        </w:rPr>
-        <w:t xml:space="preserve">Các dấu hiệu dẫn tới hình vuông:</w:t>
-      </w:r>
-    </w:p>
-    <w:p>
-      <w:pPr>
-        <w:pBdr>
-          <w:top w:val="single" w:color="D0D5DD" w:sz="4" w:space="4"/>
-        </w:pBdr>
-        <w:shd w:fill="F2F4F7" w:color="auto" w:val="clear"/>
-        <w:spacing w:after="0" w:before="0" w:line="260"/>
-        <w:ind w:left="200" w:right="200"/>
-      </w:pPr>
-      <w:r>
-        <w:rPr>
-          <w:rFonts w:ascii="Consolas" w:cs="Consolas" w:eastAsia="Consolas" w:hAnsi="Consolas"/>
-          <w:sz w:val="19"/>
-          <w:szCs w:val="19"/>
-        </w:rPr>
-        <w:t xml:space="preserve">MATCH p = (:Hinh)&lt;-[:AP_DUNG_CHO]-(d:DauHieu)-[:KET_LUAN]-&gt;(:Hinh {ma:'HINH_VUONG'})</w:t>
-      </w:r>
-    </w:p>
-    <w:p>
-      <w:pPr>
-        <w:shd w:fill="F2F4F7" w:color="auto" w:val="clear"/>
-        <w:spacing w:after="0" w:before="0" w:line="260"/>
-        <w:ind w:left="200" w:right="200"/>
-      </w:pPr>
-      <w:r>
-        <w:rPr>
-          <w:rFonts w:ascii="Consolas" w:cs="Consolas" w:eastAsia="Consolas" w:hAnsi="Consolas"/>
-          <w:sz w:val="19"/>
-          <w:szCs w:val="19"/>
-        </w:rPr>
-        <w:t xml:space="preserve">OPTIONAL MATCH q = (d)-[:CAN]-&gt;(:TinhChat)</w:t>
-      </w:r>
-    </w:p>
-    <w:p>
-      <w:pPr>
-        <w:pBdr>
-          <w:bottom w:val="single" w:color="D0D5DD" w:sz="4" w:space="4"/>
-        </w:pBdr>
-        <w:shd w:fill="F2F4F7" w:color="auto" w:val="clear"/>
-        <w:spacing w:after="0" w:before="0" w:line="260"/>
-        <w:ind w:left="200" w:right="200"/>
-      </w:pPr>
-      <w:r>
-        <w:rPr>
-          <w:rFonts w:ascii="Consolas" w:cs="Consolas" w:eastAsia="Consolas" w:hAnsi="Consolas"/>
-          <w:sz w:val="19"/>
-          <w:szCs w:val="19"/>
-        </w:rPr>
-        <w:t xml:space="preserve">RETURN p, q</w:t>
-      </w:r>
-    </w:p>
-    <w:p>
-      <w:pPr>
-        <w:spacing w:after="80"/>
-      </w:pPr>
-    </w:p>
-    <w:p>
-      <w:pPr>
-        <w:spacing w:after="120" w:line="312"/>
-        <w:jc w:val="both"/>
-      </w:pPr>
-      <w:r>
-        <w:rPr>
-          <w:rFonts w:ascii="Times New Roman" w:cs="Times New Roman" w:eastAsia="Times New Roman" w:hAnsi="Times New Roman"/>
-          <w:sz w:val="26"/>
-          <w:szCs w:val="26"/>
-        </w:rPr>
-        <w:t xml:space="preserve">Mọi tính chất của hình chữ nhật, kể cả tính chất kế thừa:</w:t>
-      </w:r>
-    </w:p>
-    <w:p>
-      <w:pPr>
-        <w:pBdr>
-          <w:top w:val="single" w:color="D0D5DD" w:sz="4" w:space="4"/>
-        </w:pBdr>
-        <w:shd w:fill="F2F4F7" w:color="auto" w:val="clear"/>
-        <w:spacing w:after="0" w:before="0" w:line="260"/>
-        <w:ind w:left="200" w:right="200"/>
-      </w:pPr>
-      <w:r>
-        <w:rPr>
-          <w:rFonts w:ascii="Consolas" w:cs="Consolas" w:eastAsia="Consolas" w:hAnsi="Consolas"/>
-          <w:sz w:val="19"/>
-          <w:szCs w:val="19"/>
-        </w:rPr>
-        <w:t xml:space="preserve">MATCH (:Hinh {ma:'HINH_CHU_NHAT'})-[:LA_MOT*0..]-&gt;(a)-[:CO_TINH_CHAT]-&gt;(t)</w:t>
-      </w:r>
-    </w:p>
-    <w:p>
-      <w:pPr>
-        <w:pBdr>
-          <w:bottom w:val="single" w:color="D0D5DD" w:sz="4" w:space="4"/>
-        </w:pBdr>
-        <w:shd w:fill="F2F4F7" w:color="auto" w:val="clear"/>
-        <w:spacing w:after="0" w:before="0" w:line="260"/>
-        <w:ind w:left="200" w:right="200"/>
-      </w:pPr>
-      <w:r>
-        <w:rPr>
-          <w:rFonts w:ascii="Consolas" w:cs="Consolas" w:eastAsia="Consolas" w:hAnsi="Consolas"/>
-          <w:sz w:val="19"/>
-          <w:szCs w:val="19"/>
-        </w:rPr>
-        <w:t xml:space="preserve">RETURN t.ten AS tinh_chat, collect(DISTINCT a.ten) AS ke_thua_tu</w:t>
-      </w:r>
-    </w:p>
-    <w:p>
-      <w:pPr>
-        <w:spacing w:after="80"/>
-      </w:pPr>
-    </w:p>
-    <w:p>
-      <w:pPr>
-        <w:spacing w:after="120" w:line="312"/>
-        <w:jc w:val="both"/>
-      </w:pPr>
-      <w:r>
-        <w:rPr>
-          <w:rFonts w:ascii="Times New Roman" w:cs="Times New Roman" w:eastAsia="Times New Roman" w:hAnsi="Times New Roman"/>
-          <w:sz w:val="26"/>
-          <w:szCs w:val="26"/>
-        </w:rPr>
-        <w:t xml:space="preserve">Thêm nhiều truy vấn khác có trong file cypher\queries.cypher. Nếu không muốn dùng Python, có thể tạo toàn bộ đồ thị bằng cách dán file cypher\seed.cypher vào Neo4j Browser. Trước đó cần bật “Enable multi statement query editor” trong phần Settings của Neo4j Browser.</w:t>
-      </w:r>
-    </w:p>
-    <w:p>
-      <w:pPr>
-        <w:pStyle w:val="Heading2"/>
-        <w:spacing w:after="120" w:before="240"/>
-      </w:pPr>
-      <w:r>
-        <w:rPr>
-          <w:rFonts w:ascii="Times New Roman" w:cs="Times New Roman" w:eastAsia="Times New Roman" w:hAnsi="Times New Roman"/>
-        </w:rPr>
-        <w:t xml:space="preserve">6.2. API JSON</w:t>
-      </w:r>
-    </w:p>
-    <w:p>
-      <w:pPr>
-        <w:spacing w:after="120" w:line="312"/>
-        <w:jc w:val="both"/>
-      </w:pPr>
-      <w:r>
-        <w:rPr>
-          <w:rFonts w:ascii="Times New Roman" w:cs="Times New Roman" w:eastAsia="Times New Roman" w:hAnsi="Times New Roman"/>
-          <w:sz w:val="26"/>
-          <w:szCs w:val="26"/>
-        </w:rPr>
-        <w:t xml:space="preserve">Ứng dụng có thêm API để chương trình khác gọi tới. Ví dụ:</w:t>
-      </w:r>
-    </w:p>
-    <w:p>
-      <w:pPr>
-        <w:pBdr>
-          <w:top w:val="single" w:color="D0D5DD" w:sz="4" w:space="4"/>
-        </w:pBdr>
-        <w:shd w:fill="F2F4F7" w:color="auto" w:val="clear"/>
-        <w:spacing w:after="0" w:before="0" w:line="260"/>
-        <w:ind w:left="200" w:right="200"/>
-      </w:pPr>
-      <w:r>
-        <w:rPr>
-          <w:rFonts w:ascii="Consolas" w:cs="Consolas" w:eastAsia="Consolas" w:hAnsi="Consolas"/>
-          <w:sz w:val="19"/>
-          <w:szCs w:val="19"/>
-        </w:rPr>
-        <w:t xml:space="preserve">http://localhost:5000/api/suy-luan?hinh=HINH_BINH_HANH&amp;tc=CHEO_VUONG_GOC&amp;tc=CHEO_BANG</w:t>
-      </w:r>
-    </w:p>
-    <w:p>
-      <w:pPr>
-        <w:spacing w:after="80"/>
-      </w:pPr>
+        <w:t xml:space="preserve">Tab Bài toán mẫu liệt kê 10 bài toán kèm kết luận do hệ thống tự giải. Bấm “Xem lời giải” để mở bài đó ở trang Nhận dạng với giả thiết đã được chọn sẵn.</w:t>
+      </w:r>
     </w:p>
     <w:p>
       <w:pPr>
@@ -2844,9 +2903,9 @@
       <w:r>
         <w:drawing>
           <wp:inline distT="0" distB="0" distL="0" distR="0">
-            <wp:extent cx="4286250" cy="5715000"/>
+            <wp:extent cx="5715000" cy="3810000"/>
             <wp:effectExtent t="0" r="0" b="0" l="0"/>
-            <wp:docPr id="1" name="11_api_json.png" descr="Kết quả API dạng JSON" title="Kết quả API dạng JSON"/>
+            <wp:docPr id="1" name="08_bai_toan_mau.png" descr="Trang Bài toán mẫu" title="Trang Bài toán mẫu"/>
             <wp:cNvGraphicFramePr>
               <a:graphicFrameLocks xmlns:a="http://schemas.openxmlformats.org/drawingml/2006/main" noChangeAspect="1"/>
             </wp:cNvGraphicFramePr>
@@ -2869,6 +2928,704 @@
                   <pic:spPr bwMode="auto">
                     <a:xfrm>
                       <a:off x="0" y="0"/>
+                      <a:ext cx="5715000" cy="3810000"/>
+                    </a:xfrm>
+                    <a:prstGeom prst="rect">
+                      <a:avLst/>
+                    </a:prstGeom>
+                  </pic:spPr>
+                </pic:pic>
+              </a:graphicData>
+            </a:graphic>
+          </wp:inline>
+        </w:drawing>
+      </w:r>
+    </w:p>
+    <w:p>
+      <w:pPr>
+        <w:spacing w:after="200"/>
+        <w:jc w:val="center"/>
+      </w:pPr>
+      <w:r>
+        <w:rPr>
+          <w:rFonts w:ascii="Times New Roman" w:cs="Times New Roman" w:eastAsia="Times New Roman" w:hAnsi="Times New Roman"/>
+          <w:i/>
+          <w:iCs/>
+          <w:sz w:val="22"/>
+          <w:szCs w:val="22"/>
+        </w:rPr>
+        <w:t xml:space="preserve">Hình 12. Trang Bài toán mẫu</w:t>
+      </w:r>
+    </w:p>
+    <w:p>
+      <w:pPr>
+        <w:pStyle w:val="Heading1"/>
+        <w:spacing w:after="160" w:before="360"/>
+      </w:pPr>
+      <w:r>
+        <w:rPr>
+          <w:rFonts w:ascii="Times New Roman" w:cs="Times New Roman" w:eastAsia="Times New Roman" w:hAnsi="Times New Roman"/>
+        </w:rPr>
+        <w:t xml:space="preserve">6. Đồ thị tri thức và tra cứu</w:t>
+      </w:r>
+    </w:p>
+    <w:p>
+      <w:pPr>
+        <w:spacing w:after="120" w:line="312"/>
+        <w:jc w:val="both"/>
+      </w:pPr>
+      <w:r>
+        <w:rPr>
+          <w:rFonts w:ascii="Times New Roman" w:cs="Times New Roman" w:eastAsia="Times New Roman" w:hAnsi="Times New Roman"/>
+          <w:sz w:val="26"/>
+          <w:szCs w:val="26"/>
+        </w:rPr>
+        <w:t xml:space="preserve">Tab Đồ thị tri thức cho biết số nút và số quan hệ đang có trong Neo4j, sơ đồ phân cấp, lược đồ đồ thị, bảng toàn bộ dấu hiệu nhận biết và các câu truy vấn mẫu để chạy trong Neo4j Browser.</w:t>
+      </w:r>
+    </w:p>
+    <w:p>
+      <w:pPr>
+        <w:spacing w:after="60" w:before="120"/>
+        <w:jc w:val="center"/>
+      </w:pPr>
+      <w:r>
+        <w:drawing>
+          <wp:inline distT="0" distB="0" distL="0" distR="0">
+            <wp:extent cx="5715000" cy="4933950"/>
+            <wp:effectExtent t="0" r="0" b="0" l="0"/>
+            <wp:docPr id="1" name="09a_do_thi_so_do.png" descr="Thống kê đồ thị và sơ đồ phân cấp" title="Thống kê đồ thị và sơ đồ phân cấp"/>
+            <wp:cNvGraphicFramePr>
+              <a:graphicFrameLocks xmlns:a="http://schemas.openxmlformats.org/drawingml/2006/main" noChangeAspect="1"/>
+            </wp:cNvGraphicFramePr>
+            <a:graphic xmlns:a="http://schemas.openxmlformats.org/drawingml/2006/main">
+              <a:graphicData uri="http://schemas.openxmlformats.org/drawingml/2006/picture">
+                <pic:pic xmlns:pic="http://schemas.openxmlformats.org/drawingml/2006/picture">
+                  <pic:nvPicPr>
+                    <pic:cNvPr id="0" name="" descr=""/>
+                    <pic:cNvPicPr>
+                      <a:picLocks noChangeAspect="1" noChangeArrowheads="1"/>
+                    </pic:cNvPicPr>
+                  </pic:nvPicPr>
+                  <pic:blipFill>
+                    <a:blip r:embed="rId20" cstate="none"/>
+                    <a:srcRect/>
+                    <a:stretch>
+                      <a:fillRect/>
+                    </a:stretch>
+                  </pic:blipFill>
+                  <pic:spPr bwMode="auto">
+                    <a:xfrm>
+                      <a:off x="0" y="0"/>
+                      <a:ext cx="5715000" cy="4933950"/>
+                    </a:xfrm>
+                    <a:prstGeom prst="rect">
+                      <a:avLst/>
+                    </a:prstGeom>
+                  </pic:spPr>
+                </pic:pic>
+              </a:graphicData>
+            </a:graphic>
+          </wp:inline>
+        </w:drawing>
+      </w:r>
+    </w:p>
+    <w:p>
+      <w:pPr>
+        <w:spacing w:after="200"/>
+        <w:jc w:val="center"/>
+      </w:pPr>
+      <w:r>
+        <w:rPr>
+          <w:rFonts w:ascii="Times New Roman" w:cs="Times New Roman" w:eastAsia="Times New Roman" w:hAnsi="Times New Roman"/>
+          <w:i/>
+          <w:iCs/>
+          <w:sz w:val="22"/>
+          <w:szCs w:val="22"/>
+        </w:rPr>
+        <w:t xml:space="preserve">Hình 13. Thống kê đồ thị và sơ đồ phân cấp</w:t>
+      </w:r>
+    </w:p>
+    <w:p>
+      <w:pPr>
+        <w:spacing w:after="60" w:before="120"/>
+        <w:jc w:val="center"/>
+      </w:pPr>
+      <w:r>
+        <w:drawing>
+          <wp:inline distT="0" distB="0" distL="0" distR="0">
+            <wp:extent cx="3895725" cy="7620000"/>
+            <wp:effectExtent t="0" r="0" b="0" l="0"/>
+            <wp:docPr id="1" name="09b_do_thi_dau_hieu.png" descr="Bảng dấu hiệu nhận biết và truy vấn mẫu" title="Bảng dấu hiệu nhận biết và truy vấn mẫu"/>
+            <wp:cNvGraphicFramePr>
+              <a:graphicFrameLocks xmlns:a="http://schemas.openxmlformats.org/drawingml/2006/main" noChangeAspect="1"/>
+            </wp:cNvGraphicFramePr>
+            <a:graphic xmlns:a="http://schemas.openxmlformats.org/drawingml/2006/main">
+              <a:graphicData uri="http://schemas.openxmlformats.org/drawingml/2006/picture">
+                <pic:pic xmlns:pic="http://schemas.openxmlformats.org/drawingml/2006/picture">
+                  <pic:nvPicPr>
+                    <pic:cNvPr id="0" name="" descr=""/>
+                    <pic:cNvPicPr>
+                      <a:picLocks noChangeAspect="1" noChangeArrowheads="1"/>
+                    </pic:cNvPicPr>
+                  </pic:nvPicPr>
+                  <pic:blipFill>
+                    <a:blip r:embed="rId21" cstate="none"/>
+                    <a:srcRect/>
+                    <a:stretch>
+                      <a:fillRect/>
+                    </a:stretch>
+                  </pic:blipFill>
+                  <pic:spPr bwMode="auto">
+                    <a:xfrm>
+                      <a:off x="0" y="0"/>
+                      <a:ext cx="3895725" cy="7620000"/>
+                    </a:xfrm>
+                    <a:prstGeom prst="rect">
+                      <a:avLst/>
+                    </a:prstGeom>
+                  </pic:spPr>
+                </pic:pic>
+              </a:graphicData>
+            </a:graphic>
+          </wp:inline>
+        </w:drawing>
+      </w:r>
+    </w:p>
+    <w:p>
+      <w:pPr>
+        <w:spacing w:after="200"/>
+        <w:jc w:val="center"/>
+      </w:pPr>
+      <w:r>
+        <w:rPr>
+          <w:rFonts w:ascii="Times New Roman" w:cs="Times New Roman" w:eastAsia="Times New Roman" w:hAnsi="Times New Roman"/>
+          <w:i/>
+          <w:iCs/>
+          <w:sz w:val="22"/>
+          <w:szCs w:val="22"/>
+        </w:rPr>
+        <w:t xml:space="preserve">Hình 14. Bảng dấu hiệu nhận biết và truy vấn mẫu</w:t>
+      </w:r>
+    </w:p>
+    <w:p>
+      <w:pPr>
+        <w:spacing w:after="120" w:line="312"/>
+        <w:jc w:val="both"/>
+      </w:pPr>
+      <w:r>
+        <w:rPr>
+          <w:rFonts w:ascii="Times New Roman" w:cs="Times New Roman" w:eastAsia="Times New Roman" w:hAnsi="Times New Roman"/>
+          <w:sz w:val="26"/>
+          <w:szCs w:val="26"/>
+        </w:rPr>
+        <w:t xml:space="preserve">Bấm vào một hình trên sơ đồ để mở trang tra cứu hình đó. Trang tra cứu có định nghĩa, hình cha và hình con, các dấu hiệu nhận biết, những hình có thể suy ra tiếp, toàn bộ tính chất (tính chất riêng được in đậm, còn lại ghi rõ kế thừa từ hình nào) và bảng công thức kèm hình vẽ minh hoạ.</w:t>
+      </w:r>
+    </w:p>
+    <w:p>
+      <w:pPr>
+        <w:spacing w:after="60" w:before="120"/>
+        <w:jc w:val="center"/>
+      </w:pPr>
+      <w:r>
+        <w:drawing>
+          <wp:inline distT="0" distB="0" distL="0" distR="0">
+            <wp:extent cx="4438650" cy="6667500"/>
+            <wp:effectExtent t="0" r="0" b="0" l="0"/>
+            <wp:docPr id="1" name="10_tra_cuu_hinh_vuong.png" descr="Trang tra cứu Hình vuông" title="Trang tra cứu Hình vuông"/>
+            <wp:cNvGraphicFramePr>
+              <a:graphicFrameLocks xmlns:a="http://schemas.openxmlformats.org/drawingml/2006/main" noChangeAspect="1"/>
+            </wp:cNvGraphicFramePr>
+            <a:graphic xmlns:a="http://schemas.openxmlformats.org/drawingml/2006/main">
+              <a:graphicData uri="http://schemas.openxmlformats.org/drawingml/2006/picture">
+                <pic:pic xmlns:pic="http://schemas.openxmlformats.org/drawingml/2006/picture">
+                  <pic:nvPicPr>
+                    <pic:cNvPr id="0" name="" descr=""/>
+                    <pic:cNvPicPr>
+                      <a:picLocks noChangeAspect="1" noChangeArrowheads="1"/>
+                    </pic:cNvPicPr>
+                  </pic:nvPicPr>
+                  <pic:blipFill>
+                    <a:blip r:embed="rId22" cstate="none"/>
+                    <a:srcRect/>
+                    <a:stretch>
+                      <a:fillRect/>
+                    </a:stretch>
+                  </pic:blipFill>
+                  <pic:spPr bwMode="auto">
+                    <a:xfrm>
+                      <a:off x="0" y="0"/>
+                      <a:ext cx="4438650" cy="6667500"/>
+                    </a:xfrm>
+                    <a:prstGeom prst="rect">
+                      <a:avLst/>
+                    </a:prstGeom>
+                  </pic:spPr>
+                </pic:pic>
+              </a:graphicData>
+            </a:graphic>
+          </wp:inline>
+        </w:drawing>
+      </w:r>
+    </w:p>
+    <w:p>
+      <w:pPr>
+        <w:spacing w:after="200"/>
+        <w:jc w:val="center"/>
+      </w:pPr>
+      <w:r>
+        <w:rPr>
+          <w:rFonts w:ascii="Times New Roman" w:cs="Times New Roman" w:eastAsia="Times New Roman" w:hAnsi="Times New Roman"/>
+          <w:i/>
+          <w:iCs/>
+          <w:sz w:val="22"/>
+          <w:szCs w:val="22"/>
+        </w:rPr>
+        <w:t xml:space="preserve">Hình 15. Trang tra cứu Hình vuông</w:t>
+      </w:r>
+    </w:p>
+    <w:p>
+      <w:pPr>
+        <w:pStyle w:val="Heading1"/>
+        <w:spacing w:after="160" w:before="360"/>
+      </w:pPr>
+      <w:r>
+        <w:rPr>
+          <w:rFonts w:ascii="Times New Roman" w:cs="Times New Roman" w:eastAsia="Times New Roman" w:hAnsi="Times New Roman"/>
+        </w:rPr>
+        <w:t xml:space="preserve">7. Dùng trực tiếp trong Neo4j Browser và qua API</w:t>
+      </w:r>
+    </w:p>
+    <w:p>
+      <w:pPr>
+        <w:pStyle w:val="Heading2"/>
+        <w:spacing w:after="120" w:before="240"/>
+      </w:pPr>
+      <w:r>
+        <w:rPr>
+          <w:rFonts w:ascii="Times New Roman" w:cs="Times New Roman" w:eastAsia="Times New Roman" w:hAnsi="Times New Roman"/>
+        </w:rPr>
+        <w:t xml:space="preserve">7.1. Neo4j Browser</w:t>
+      </w:r>
+    </w:p>
+    <w:p>
+      <w:pPr>
+        <w:spacing w:after="120" w:line="312"/>
+        <w:jc w:val="both"/>
+      </w:pPr>
+      <w:r>
+        <w:rPr>
+          <w:rFonts w:ascii="Times New Roman" w:cs="Times New Roman" w:eastAsia="Times New Roman" w:hAnsi="Times New Roman"/>
+          <w:sz w:val="26"/>
+          <w:szCs w:val="26"/>
+        </w:rPr>
+        <w:t xml:space="preserve">Mở </w:t>
+      </w:r>
+      <w:r>
+        <w:rPr>
+          <w:rFonts w:ascii="Times New Roman" w:cs="Times New Roman" w:eastAsia="Times New Roman" w:hAnsi="Times New Roman"/>
+          <w:b/>
+          <w:bCs/>
+          <w:sz w:val="26"/>
+          <w:szCs w:val="26"/>
+        </w:rPr>
+        <w:t xml:space="preserve">http://localhost:7474</w:t>
+      </w:r>
+      <w:r>
+        <w:rPr>
+          <w:rFonts w:ascii="Times New Roman" w:cs="Times New Roman" w:eastAsia="Times New Roman" w:hAnsi="Times New Roman"/>
+          <w:sz w:val="26"/>
+          <w:szCs w:val="26"/>
+        </w:rPr>
+        <w:t xml:space="preserve"> và đăng nhập bằng neo4j / matkhau123. Gõ câu lệnh vào ô ở trên cùng rồi nhấn Ctrl + Enter. Ví dụ, xem sơ đồ phân cấp:</w:t>
+      </w:r>
+    </w:p>
+    <w:p>
+      <w:pPr>
+        <w:pBdr>
+          <w:top w:val="single" w:color="D0D5DD" w:sz="4" w:space="4"/>
+        </w:pBdr>
+        <w:shd w:fill="F2F4F7" w:color="auto" w:val="clear"/>
+        <w:spacing w:after="0" w:before="0" w:line="260"/>
+        <w:ind w:left="200" w:right="200"/>
+      </w:pPr>
+      <w:r>
+        <w:rPr>
+          <w:rFonts w:ascii="Consolas" w:cs="Consolas" w:eastAsia="Consolas" w:hAnsi="Consolas"/>
+          <w:sz w:val="19"/>
+          <w:szCs w:val="19"/>
+        </w:rPr>
+        <w:t xml:space="preserve">MATCH p = (:Hinh)-[:LA_MOT]-&gt;(:Hinh) RETURN p</w:t>
+      </w:r>
+    </w:p>
+    <w:p>
+      <w:pPr>
+        <w:spacing w:after="80"/>
+      </w:pPr>
+    </w:p>
+    <w:p>
+      <w:pPr>
+        <w:spacing w:after="120" w:line="312"/>
+        <w:jc w:val="both"/>
+      </w:pPr>
+      <w:r>
+        <w:rPr>
+          <w:rFonts w:ascii="Times New Roman" w:cs="Times New Roman" w:eastAsia="Times New Roman" w:hAnsi="Times New Roman"/>
+          <w:sz w:val="26"/>
+          <w:szCs w:val="26"/>
+        </w:rPr>
+        <w:t xml:space="preserve">Các dấu hiệu dẫn tới hình vuông:</w:t>
+      </w:r>
+    </w:p>
+    <w:p>
+      <w:pPr>
+        <w:pBdr>
+          <w:top w:val="single" w:color="D0D5DD" w:sz="4" w:space="4"/>
+        </w:pBdr>
+        <w:shd w:fill="F2F4F7" w:color="auto" w:val="clear"/>
+        <w:spacing w:after="0" w:before="0" w:line="260"/>
+        <w:ind w:left="200" w:right="200"/>
+      </w:pPr>
+      <w:r>
+        <w:rPr>
+          <w:rFonts w:ascii="Consolas" w:cs="Consolas" w:eastAsia="Consolas" w:hAnsi="Consolas"/>
+          <w:sz w:val="19"/>
+          <w:szCs w:val="19"/>
+        </w:rPr>
+        <w:t xml:space="preserve">MATCH p = (:Hinh)&lt;-[:AP_DUNG_CHO]-(d:DauHieu)-[:KET_LUAN]-&gt;(:Hinh {ma:'HINH_VUONG'})</w:t>
+      </w:r>
+    </w:p>
+    <w:p>
+      <w:pPr>
+        <w:shd w:fill="F2F4F7" w:color="auto" w:val="clear"/>
+        <w:spacing w:after="0" w:before="0" w:line="260"/>
+        <w:ind w:left="200" w:right="200"/>
+      </w:pPr>
+      <w:r>
+        <w:rPr>
+          <w:rFonts w:ascii="Consolas" w:cs="Consolas" w:eastAsia="Consolas" w:hAnsi="Consolas"/>
+          <w:sz w:val="19"/>
+          <w:szCs w:val="19"/>
+        </w:rPr>
+        <w:t xml:space="preserve">OPTIONAL MATCH q = (d)-[:CAN]-&gt;(:TinhChat)</w:t>
+      </w:r>
+    </w:p>
+    <w:p>
+      <w:pPr>
+        <w:pBdr>
+          <w:bottom w:val="single" w:color="D0D5DD" w:sz="4" w:space="4"/>
+        </w:pBdr>
+        <w:shd w:fill="F2F4F7" w:color="auto" w:val="clear"/>
+        <w:spacing w:after="0" w:before="0" w:line="260"/>
+        <w:ind w:left="200" w:right="200"/>
+      </w:pPr>
+      <w:r>
+        <w:rPr>
+          <w:rFonts w:ascii="Consolas" w:cs="Consolas" w:eastAsia="Consolas" w:hAnsi="Consolas"/>
+          <w:sz w:val="19"/>
+          <w:szCs w:val="19"/>
+        </w:rPr>
+        <w:t xml:space="preserve">RETURN p, q</w:t>
+      </w:r>
+    </w:p>
+    <w:p>
+      <w:pPr>
+        <w:spacing w:after="80"/>
+      </w:pPr>
+    </w:p>
+    <w:p>
+      <w:pPr>
+        <w:spacing w:after="120" w:line="312"/>
+        <w:jc w:val="both"/>
+      </w:pPr>
+      <w:r>
+        <w:rPr>
+          <w:rFonts w:ascii="Times New Roman" w:cs="Times New Roman" w:eastAsia="Times New Roman" w:hAnsi="Times New Roman"/>
+          <w:sz w:val="26"/>
+          <w:szCs w:val="26"/>
+        </w:rPr>
+        <w:t xml:space="preserve">Mọi tính chất của hình chữ nhật, kể cả tính chất kế thừa:</w:t>
+      </w:r>
+    </w:p>
+    <w:p>
+      <w:pPr>
+        <w:pBdr>
+          <w:top w:val="single" w:color="D0D5DD" w:sz="4" w:space="4"/>
+        </w:pBdr>
+        <w:shd w:fill="F2F4F7" w:color="auto" w:val="clear"/>
+        <w:spacing w:after="0" w:before="0" w:line="260"/>
+        <w:ind w:left="200" w:right="200"/>
+      </w:pPr>
+      <w:r>
+        <w:rPr>
+          <w:rFonts w:ascii="Consolas" w:cs="Consolas" w:eastAsia="Consolas" w:hAnsi="Consolas"/>
+          <w:sz w:val="19"/>
+          <w:szCs w:val="19"/>
+        </w:rPr>
+        <w:t xml:space="preserve">MATCH (:Hinh {ma:'HINH_CHU_NHAT'})-[:LA_MOT*0..]-&gt;(a)-[:CO_TINH_CHAT]-&gt;(t)</w:t>
+      </w:r>
+    </w:p>
+    <w:p>
+      <w:pPr>
+        <w:pBdr>
+          <w:bottom w:val="single" w:color="D0D5DD" w:sz="4" w:space="4"/>
+        </w:pBdr>
+        <w:shd w:fill="F2F4F7" w:color="auto" w:val="clear"/>
+        <w:spacing w:after="0" w:before="0" w:line="260"/>
+        <w:ind w:left="200" w:right="200"/>
+      </w:pPr>
+      <w:r>
+        <w:rPr>
+          <w:rFonts w:ascii="Consolas" w:cs="Consolas" w:eastAsia="Consolas" w:hAnsi="Consolas"/>
+          <w:sz w:val="19"/>
+          <w:szCs w:val="19"/>
+        </w:rPr>
+        <w:t xml:space="preserve">RETURN t.ten AS tinh_chat, collect(DISTINCT a.ten) AS ke_thua_tu</w:t>
+      </w:r>
+    </w:p>
+    <w:p>
+      <w:pPr>
+        <w:spacing w:after="80"/>
+      </w:pPr>
+    </w:p>
+    <w:p>
+      <w:pPr>
+        <w:spacing w:after="120" w:line="312"/>
+        <w:jc w:val="both"/>
+      </w:pPr>
+      <w:r>
+        <w:rPr>
+          <w:rFonts w:ascii="Times New Roman" w:cs="Times New Roman" w:eastAsia="Times New Roman" w:hAnsi="Times New Roman"/>
+          <w:sz w:val="26"/>
+          <w:szCs w:val="26"/>
+        </w:rPr>
+        <w:t xml:space="preserve">Công thức diện tích và chu vi của mọi hình:</w:t>
+      </w:r>
+    </w:p>
+    <w:p>
+      <w:pPr>
+        <w:pBdr>
+          <w:top w:val="single" w:color="D0D5DD" w:sz="4" w:space="4"/>
+        </w:pBdr>
+        <w:shd w:fill="F2F4F7" w:color="auto" w:val="clear"/>
+        <w:spacing w:after="0" w:before="0" w:line="260"/>
+        <w:ind w:left="200" w:right="200"/>
+      </w:pPr>
+      <w:r>
+        <w:rPr>
+          <w:rFonts w:ascii="Consolas" w:cs="Consolas" w:eastAsia="Consolas" w:hAnsi="Consolas"/>
+          <w:sz w:val="19"/>
+          <w:szCs w:val="19"/>
+        </w:rPr>
+        <w:t xml:space="preserve">MATCH (h:Hinh)-[:CO_CONG_THUC]-&gt;(c:CongThuc)</w:t>
+      </w:r>
+    </w:p>
+    <w:p>
+      <w:pPr>
+        <w:shd w:fill="F2F4F7" w:color="auto" w:val="clear"/>
+        <w:spacing w:after="0" w:before="0" w:line="260"/>
+        <w:ind w:left="200" w:right="200"/>
+      </w:pPr>
+      <w:r>
+        <w:rPr>
+          <w:rFonts w:ascii="Consolas" w:cs="Consolas" w:eastAsia="Consolas" w:hAnsi="Consolas"/>
+          <w:sz w:val="19"/>
+          <w:szCs w:val="19"/>
+        </w:rPr>
+        <w:t xml:space="preserve">WHERE c.loai IN ['dien_tich', 'chu_vi']</w:t>
+      </w:r>
+    </w:p>
+    <w:p>
+      <w:pPr>
+        <w:pBdr>
+          <w:bottom w:val="single" w:color="D0D5DD" w:sz="4" w:space="4"/>
+        </w:pBdr>
+        <w:shd w:fill="F2F4F7" w:color="auto" w:val="clear"/>
+        <w:spacing w:after="0" w:before="0" w:line="260"/>
+        <w:ind w:left="200" w:right="200"/>
+      </w:pPr>
+      <w:r>
+        <w:rPr>
+          <w:rFonts w:ascii="Consolas" w:cs="Consolas" w:eastAsia="Consolas" w:hAnsi="Consolas"/>
+          <w:sz w:val="19"/>
+          <w:szCs w:val="19"/>
+        </w:rPr>
+        <w:t xml:space="preserve">RETURN h.ten AS hinh, c.loai_ten AS loai, c.hien_thi AS cong_thuc</w:t>
+      </w:r>
+    </w:p>
+    <w:p>
+      <w:pPr>
+        <w:spacing w:after="80"/>
+      </w:pPr>
+    </w:p>
+    <w:p>
+      <w:pPr>
+        <w:spacing w:after="120" w:line="312"/>
+        <w:jc w:val="both"/>
+      </w:pPr>
+      <w:r>
+        <w:rPr>
+          <w:rFonts w:ascii="Times New Roman" w:cs="Times New Roman" w:eastAsia="Times New Roman" w:hAnsi="Times New Roman"/>
+          <w:sz w:val="26"/>
+          <w:szCs w:val="26"/>
+        </w:rPr>
+        <w:t xml:space="preserve">Đồ thị công thức của hình chữ nhật:</w:t>
+      </w:r>
+    </w:p>
+    <w:p>
+      <w:pPr>
+        <w:pBdr>
+          <w:top w:val="single" w:color="D0D5DD" w:sz="4" w:space="4"/>
+        </w:pBdr>
+        <w:shd w:fill="F2F4F7" w:color="auto" w:val="clear"/>
+        <w:spacing w:after="0" w:before="0" w:line="260"/>
+        <w:ind w:left="200" w:right="200"/>
+      </w:pPr>
+      <w:r>
+        <w:rPr>
+          <w:rFonts w:ascii="Consolas" w:cs="Consolas" w:eastAsia="Consolas" w:hAnsi="Consolas"/>
+          <w:sz w:val="19"/>
+          <w:szCs w:val="19"/>
+        </w:rPr>
+        <w:t xml:space="preserve">MATCH p = (:Hinh {ma:'HINH_CHU_NHAT'})-[:CO_CONG_THUC]-&gt;(:CongThuc)-[:TINH_RA|CAN_BIEN]-&gt;(:DaiLuong)</w:t>
+      </w:r>
+    </w:p>
+    <w:p>
+      <w:pPr>
+        <w:pBdr>
+          <w:bottom w:val="single" w:color="D0D5DD" w:sz="4" w:space="4"/>
+        </w:pBdr>
+        <w:shd w:fill="F2F4F7" w:color="auto" w:val="clear"/>
+        <w:spacing w:after="0" w:before="0" w:line="260"/>
+        <w:ind w:left="200" w:right="200"/>
+      </w:pPr>
+      <w:r>
+        <w:rPr>
+          <w:rFonts w:ascii="Consolas" w:cs="Consolas" w:eastAsia="Consolas" w:hAnsi="Consolas"/>
+          <w:sz w:val="19"/>
+          <w:szCs w:val="19"/>
+        </w:rPr>
+        <w:t xml:space="preserve">RETURN p</w:t>
+      </w:r>
+    </w:p>
+    <w:p>
+      <w:pPr>
+        <w:spacing w:after="80"/>
+      </w:pPr>
+    </w:p>
+    <w:p>
+      <w:pPr>
+        <w:spacing w:after="120" w:line="312"/>
+        <w:jc w:val="both"/>
+      </w:pPr>
+      <w:r>
+        <w:rPr>
+          <w:rFonts w:ascii="Times New Roman" w:cs="Times New Roman" w:eastAsia="Times New Roman" w:hAnsi="Times New Roman"/>
+          <w:sz w:val="26"/>
+          <w:szCs w:val="26"/>
+        </w:rPr>
+        <w:t xml:space="preserve">Thêm nhiều truy vấn khác có trong file cypher\queries.cypher. Nếu không muốn dùng Python, có thể tạo toàn bộ đồ thị bằng cách dán file cypher\seed.cypher vào Neo4j Browser. Trước đó cần bật “Enable multi statement query editor” trong phần Settings của Neo4j Browser.</w:t>
+      </w:r>
+    </w:p>
+    <w:p>
+      <w:pPr>
+        <w:pStyle w:val="Heading2"/>
+        <w:spacing w:after="120" w:before="240"/>
+      </w:pPr>
+      <w:r>
+        <w:rPr>
+          <w:rFonts w:ascii="Times New Roman" w:cs="Times New Roman" w:eastAsia="Times New Roman" w:hAnsi="Times New Roman"/>
+        </w:rPr>
+        <w:t xml:space="preserve">7.2. API JSON</w:t>
+      </w:r>
+    </w:p>
+    <w:p>
+      <w:pPr>
+        <w:spacing w:after="120" w:line="312"/>
+        <w:jc w:val="both"/>
+      </w:pPr>
+      <w:r>
+        <w:rPr>
+          <w:rFonts w:ascii="Times New Roman" w:cs="Times New Roman" w:eastAsia="Times New Roman" w:hAnsi="Times New Roman"/>
+          <w:sz w:val="26"/>
+          <w:szCs w:val="26"/>
+        </w:rPr>
+        <w:t xml:space="preserve">Ứng dụng có thêm API để chương trình khác gọi tới. Ví dụ nhận dạng và tính toán:</w:t>
+      </w:r>
+    </w:p>
+    <w:p>
+      <w:pPr>
+        <w:pBdr>
+          <w:top w:val="single" w:color="D0D5DD" w:sz="4" w:space="4"/>
+        </w:pBdr>
+        <w:shd w:fill="F2F4F7" w:color="auto" w:val="clear"/>
+        <w:spacing w:after="0" w:before="0" w:line="260"/>
+        <w:ind w:left="200" w:right="200"/>
+      </w:pPr>
+      <w:r>
+        <w:rPr>
+          <w:rFonts w:ascii="Consolas" w:cs="Consolas" w:eastAsia="Consolas" w:hAnsi="Consolas"/>
+          <w:sz w:val="19"/>
+          <w:szCs w:val="19"/>
+        </w:rPr>
+        <w:t xml:space="preserve">http://localhost:5000/api/suy-luan?hinh=HINH_BINH_HANH&amp;tc=CHEO_VUONG_GOC&amp;tc=CHEO_BANG</w:t>
+      </w:r>
+    </w:p>
+    <w:p>
+      <w:pPr>
+        <w:pBdr>
+          <w:bottom w:val="single" w:color="D0D5DD" w:sz="4" w:space="4"/>
+        </w:pBdr>
+        <w:shd w:fill="F2F4F7" w:color="auto" w:val="clear"/>
+        <w:spacing w:after="0" w:before="0" w:line="260"/>
+        <w:ind w:left="200" w:right="200"/>
+      </w:pPr>
+      <w:r>
+        <w:rPr>
+          <w:rFonts w:ascii="Consolas" w:cs="Consolas" w:eastAsia="Consolas" w:hAnsi="Consolas"/>
+          <w:sz w:val="19"/>
+          <w:szCs w:val="19"/>
+        </w:rPr>
+        <w:t xml:space="preserve">http://localhost:5000/api/tinh-toan?hinh=HINH_THOI&amp;d1=6&amp;d2=8</w:t>
+      </w:r>
+    </w:p>
+    <w:p>
+      <w:pPr>
+        <w:spacing w:after="80"/>
+      </w:pPr>
+    </w:p>
+    <w:p>
+      <w:pPr>
+        <w:spacing w:after="60" w:before="120"/>
+        <w:jc w:val="center"/>
+      </w:pPr>
+      <w:r>
+        <w:drawing>
+          <wp:inline distT="0" distB="0" distL="0" distR="0">
+            <wp:extent cx="4286250" cy="5715000"/>
+            <wp:effectExtent t="0" r="0" b="0" l="0"/>
+            <wp:docPr id="1" name="11_api_json.png" descr="Kết quả API dạng JSON" title="Kết quả API dạng JSON"/>
+            <wp:cNvGraphicFramePr>
+              <a:graphicFrameLocks xmlns:a="http://schemas.openxmlformats.org/drawingml/2006/main" noChangeAspect="1"/>
+            </wp:cNvGraphicFramePr>
+            <a:graphic xmlns:a="http://schemas.openxmlformats.org/drawingml/2006/main">
+              <a:graphicData uri="http://schemas.openxmlformats.org/drawingml/2006/picture">
+                <pic:pic xmlns:pic="http://schemas.openxmlformats.org/drawingml/2006/picture">
+                  <pic:nvPicPr>
+                    <pic:cNvPr id="0" name="" descr=""/>
+                    <pic:cNvPicPr>
+                      <a:picLocks noChangeAspect="1" noChangeArrowheads="1"/>
+                    </pic:cNvPicPr>
+                  </pic:nvPicPr>
+                  <pic:blipFill>
+                    <a:blip r:embed="rId23" cstate="none"/>
+                    <a:srcRect/>
+                    <a:stretch>
+                      <a:fillRect/>
+                    </a:stretch>
+                  </pic:blipFill>
+                  <pic:spPr bwMode="auto">
+                    <a:xfrm>
+                      <a:off x="0" y="0"/>
                       <a:ext cx="4286250" cy="5715000"/>
                     </a:xfrm>
                     <a:prstGeom prst="rect">
@@ -2895,7 +3652,7 @@
           <w:sz w:val="22"/>
           <w:szCs w:val="22"/>
         </w:rPr>
-        <w:t xml:space="preserve">Hình 12. Kết quả API dạng JSON</w:t>
+        <w:t xml:space="preserve">Hình 16. Kết quả API dạng JSON</w:t>
       </w:r>
     </w:p>
     <w:p>
@@ -2907,7 +3664,7 @@
         <w:rPr>
           <w:rFonts w:ascii="Times New Roman" w:cs="Times New Roman" w:eastAsia="Times New Roman" w:hAnsi="Times New Roman"/>
         </w:rPr>
-        <w:t xml:space="preserve">7. Đưa mã nguồn lên GitHub</w:t>
+        <w:t xml:space="preserve">8. Đưa mã nguồn lên GitHub</w:t>
       </w:r>
     </w:p>
     <w:p>
@@ -2915,7 +3672,7 @@
         <w:pStyle w:val="ListParagraph"/>
         <w:numPr>
           <w:ilvl w:val="0"/>
-          <w:numId w:val="3"/>
+          <w:numId w:val="4"/>
         </w:numPr>
         <w:spacing w:after="60" w:line="300"/>
       </w:pPr>
@@ -2933,7 +3690,7 @@
         <w:pStyle w:val="ListParagraph"/>
         <w:numPr>
           <w:ilvl w:val="0"/>
-          <w:numId w:val="3"/>
+          <w:numId w:val="4"/>
         </w:numPr>
         <w:spacing w:after="60" w:line="300"/>
       </w:pPr>
@@ -2951,7 +3708,7 @@
         <w:pStyle w:val="ListParagraph"/>
         <w:numPr>
           <w:ilvl w:val="0"/>
-          <w:numId w:val="3"/>
+          <w:numId w:val="4"/>
         </w:numPr>
         <w:spacing w:after="60" w:line="300"/>
       </w:pPr>
@@ -3083,7 +3840,7 @@
         <w:rPr>
           <w:rFonts w:ascii="Times New Roman" w:cs="Times New Roman" w:eastAsia="Times New Roman" w:hAnsi="Times New Roman"/>
         </w:rPr>
-        <w:t xml:space="preserve">8. Xử lý lỗi thường gặp</w:t>
+        <w:t xml:space="preserve">9. Xử lý lỗi thường gặp</w:t>
       </w:r>
     </w:p>
     <w:tbl>
@@ -3569,6 +4326,72 @@
           </w:p>
         </w:tc>
       </w:tr>
+      <w:tr>
+        <w:tc>
+          <w:tcPr>
+            <w:tcW w:type="dxa" w:w="3810"/>
+            <w:tcBorders>
+              <w:top w:val="single" w:color="B8C0CC" w:sz="4"/>
+              <w:left w:val="single" w:color="B8C0CC" w:sz="4"/>
+              <w:bottom w:val="single" w:color="B8C0CC" w:sz="4"/>
+              <w:right w:val="single" w:color="B8C0CC" w:sz="4"/>
+            </w:tcBorders>
+            <w:tcMar>
+              <w:top w:type="dxa" w:w="60"/>
+              <w:left w:type="dxa" w:w="100"/>
+              <w:bottom w:type="dxa" w:w="60"/>
+              <w:right w:type="dxa" w:w="100"/>
+            </w:tcMar>
+          </w:tcPr>
+          <w:p>
+            <w:pPr>
+              <w:spacing w:after="0" w:line="276"/>
+            </w:pPr>
+            <w:r>
+              <w:rPr>
+                <w:rFonts w:ascii="Times New Roman" w:cs="Times New Roman" w:eastAsia="Times New Roman" w:hAnsi="Times New Roman"/>
+                <w:b w:val="false"/>
+                <w:bCs w:val="false"/>
+                <w:sz w:val="22"/>
+                <w:szCs w:val="22"/>
+              </w:rPr>
+              <w:t xml:space="preserve">Trang Tính toán không có công thức / báo lỗi sau khi cập nhật mã nguồn</w:t>
+            </w:r>
+          </w:p>
+        </w:tc>
+        <w:tc>
+          <w:tcPr>
+            <w:tcW w:type="dxa" w:w="5261"/>
+            <w:tcBorders>
+              <w:top w:val="single" w:color="B8C0CC" w:sz="4"/>
+              <w:left w:val="single" w:color="B8C0CC" w:sz="4"/>
+              <w:bottom w:val="single" w:color="B8C0CC" w:sz="4"/>
+              <w:right w:val="single" w:color="B8C0CC" w:sz="4"/>
+            </w:tcBorders>
+            <w:tcMar>
+              <w:top w:type="dxa" w:w="60"/>
+              <w:left w:type="dxa" w:w="100"/>
+              <w:bottom w:type="dxa" w:w="60"/>
+              <w:right w:type="dxa" w:w="100"/>
+            </w:tcMar>
+          </w:tcPr>
+          <w:p>
+            <w:pPr>
+              <w:spacing w:after="0" w:line="276"/>
+            </w:pPr>
+            <w:r>
+              <w:rPr>
+                <w:rFonts w:ascii="Times New Roman" w:cs="Times New Roman" w:eastAsia="Times New Roman" w:hAnsi="Times New Roman"/>
+                <w:b w:val="false"/>
+                <w:bCs w:val="false"/>
+                <w:sz w:val="22"/>
+                <w:szCs w:val="22"/>
+              </w:rPr>
+              <w:t xml:space="preserve">Chạy lại python -m src.seed để nạp các nút :DaiLuong và :CongThuc mới, rồi khởi động lại python app.py.</w:t>
+            </w:r>
+          </w:p>
+        </w:tc>
+      </w:tr>
     </w:tbl>
     <w:p>
       <w:pPr>
@@ -3598,7 +4421,7 @@
           <w:sz w:val="26"/>
           <w:szCs w:val="26"/>
         </w:rPr>
-        <w:t xml:space="preserve">Chạy lệnh dưới để kiểm tra tri thức và bộ suy luận (không cần Neo4j). Kết quả đúng là “Ran 18 tests … OK”.</w:t>
+        <w:t xml:space="preserve">Chạy lệnh dưới để kiểm tra tri thức và bộ suy luận (không cần Neo4j). Kết quả đúng là “Ran 32 tests … OK”.</w:t>
       </w:r>
     </w:p>
     <w:p>
@@ -3938,6 +4761,12 @@
     </w:lvlOverride>
   </w:num>
   <w:num w:numId="3">
+    <w:abstractNumId w:val="5"/>
+    <w:lvlOverride w:ilvl="0">
+      <w:startOverride w:val="1"/>
+    </w:lvlOverride>
+  </w:num>
+  <w:num w:numId="4">
     <w:abstractNumId w:val="4"/>
     <w:lvlOverride w:ilvl="0">
       <w:startOverride w:val="1"/>

</xml_diff>

<commit_message>
Thêm trang Thử thách: trò chơi kéo thả đỉnh tứ giác, Neo4j chấm điểm và bảng xếp hạng
</commit_message>
<xml_diff>
--- a/docs/2_Huong_dan_su_dung.docx
+++ b/docs/2_Huong_dan_su_dung.docx
@@ -2920,7 +2920,7 @@
         <w:rPr>
           <w:rFonts w:ascii="Times New Roman" w:cs="Times New Roman" w:eastAsia="Times New Roman" w:hAnsi="Times New Roman"/>
         </w:rPr>
-        <w:t xml:space="preserve">5. Bài toán mẫu</w:t>
+        <w:t xml:space="preserve">5. Thử thách – trò chơi kéo thả tứ giác</w:t>
       </w:r>
     </w:p>
     <w:p>
@@ -2934,7 +2934,25 @@
           <w:sz w:val="26"/>
           <w:szCs w:val="26"/>
         </w:rPr>
-        <w:t xml:space="preserve">Tab Bài toán mẫu liệt kê 10 bài toán kèm kết luận do hệ thống tự giải. Bấm “Xem lời giải” để mở bài đó ở trang Nhận dạng với giả thiết đã được chọn sẵn.</w:t>
+        <w:t xml:space="preserve">Tab </w:t>
+      </w:r>
+      <w:r>
+        <w:rPr>
+          <w:rFonts w:ascii="Times New Roman" w:cs="Times New Roman" w:eastAsia="Times New Roman" w:hAnsi="Times New Roman"/>
+          <w:b/>
+          <w:bCs/>
+          <w:sz w:val="26"/>
+          <w:szCs w:val="26"/>
+        </w:rPr>
+        <w:t xml:space="preserve">Thử thách</w:t>
+      </w:r>
+      <w:r>
+        <w:rPr>
+          <w:rFonts w:ascii="Times New Roman" w:cs="Times New Roman" w:eastAsia="Times New Roman" w:hAnsi="Times New Roman"/>
+          <w:sz w:val="26"/>
+          <w:szCs w:val="26"/>
+        </w:rPr>
+        <w:t xml:space="preserve"> là một trò chơi giúp ôn lại dấu hiệu nhận biết. Màn hình có một tứ giác ABCD vẽ trên lưới ô vuông. Người chơi dùng chuột kéo các chấm tròn A, B, C, D để tạo ra hình mà đề yêu cầu. Mỗi vòng có 8 thử thách, từ dễ đến khó: hình thang, hình thang vuông, hình bình hành, hình chữ nhật, hình thang cân, hình thoi, hình diều và hình vuông.</w:t>
       </w:r>
     </w:p>
     <w:p>
@@ -2945,9 +2963,9 @@
       <w:r>
         <w:drawing>
           <wp:inline distT="0" distB="0" distL="0" distR="0">
-            <wp:extent cx="5715000" cy="3810000"/>
+            <wp:extent cx="5715000" cy="5762625"/>
             <wp:effectExtent t="0" r="0" b="0" l="0"/>
-            <wp:docPr id="1" name="08_bai_toan_mau.png" descr="Trang Bài toán mẫu" title="Trang Bài toán mẫu"/>
+            <wp:docPr id="1" name="17_thu_thach.png" descr="Trang Thử thách lúc bắt đầu: đề yêu cầu tạo hình thang" title="Trang Thử thách lúc bắt đầu: đề yêu cầu tạo hình thang"/>
             <wp:cNvGraphicFramePr>
               <a:graphicFrameLocks xmlns:a="http://schemas.openxmlformats.org/drawingml/2006/main" noChangeAspect="1"/>
             </wp:cNvGraphicFramePr>
@@ -2970,7 +2988,7 @@
                   <pic:spPr bwMode="auto">
                     <a:xfrm>
                       <a:off x="0" y="0"/>
-                      <a:ext cx="5715000" cy="3810000"/>
+                      <a:ext cx="5715000" cy="5762625"/>
                     </a:xfrm>
                     <a:prstGeom prst="rect">
                       <a:avLst/>
@@ -2996,33 +3014,163 @@
           <w:sz w:val="22"/>
           <w:szCs w:val="22"/>
         </w:rPr>
-        <w:t xml:space="preserve">Hình 12. Trang Bài toán mẫu</w:t>
-      </w:r>
-    </w:p>
-    <w:p>
-      <w:pPr>
-        <w:pStyle w:val="Heading1"/>
-        <w:spacing w:after="160" w:before="360"/>
-      </w:pPr>
-      <w:r>
-        <w:rPr>
-          <w:rFonts w:ascii="Times New Roman" w:cs="Times New Roman" w:eastAsia="Times New Roman" w:hAnsi="Times New Roman"/>
-        </w:rPr>
-        <w:t xml:space="preserve">6. Đồ thị tri thức và tra cứu</w:t>
-      </w:r>
-    </w:p>
-    <w:p>
-      <w:pPr>
-        <w:spacing w:after="120" w:line="312"/>
-        <w:jc w:val="both"/>
-      </w:pPr>
-      <w:r>
-        <w:rPr>
-          <w:rFonts w:ascii="Times New Roman" w:cs="Times New Roman" w:eastAsia="Times New Roman" w:hAnsi="Times New Roman"/>
-          <w:sz w:val="26"/>
-          <w:szCs w:val="26"/>
-        </w:rPr>
-        <w:t xml:space="preserve">Tab Đồ thị tri thức cho biết số nút và số quan hệ đang có trong Neo4j, sơ đồ phân cấp, lược đồ đồ thị, bảng toàn bộ dấu hiệu nhận biết và các câu truy vấn mẫu để chạy trong Neo4j Browser.</w:t>
+        <w:t xml:space="preserve">Hình 12. Trang Thử thách lúc bắt đầu: đề yêu cầu tạo hình thang</w:t>
+      </w:r>
+    </w:p>
+    <w:p>
+      <w:pPr>
+        <w:pStyle w:val="Heading2"/>
+        <w:spacing w:after="120" w:before="240"/>
+      </w:pPr>
+      <w:r>
+        <w:rPr>
+          <w:rFonts w:ascii="Times New Roman" w:cs="Times New Roman" w:eastAsia="Times New Roman" w:hAnsi="Times New Roman"/>
+        </w:rPr>
+        <w:t xml:space="preserve">5.1. Cách chơi</w:t>
+      </w:r>
+    </w:p>
+    <w:p>
+      <w:pPr>
+        <w:pStyle w:val="ListParagraph"/>
+        <w:numPr>
+          <w:ilvl w:val="0"/>
+          <w:numId w:val="4"/>
+        </w:numPr>
+        <w:spacing w:after="60" w:line="300"/>
+      </w:pPr>
+      <w:r>
+        <w:rPr>
+          <w:rFonts w:ascii="Times New Roman" w:cs="Times New Roman" w:eastAsia="Times New Roman" w:hAnsi="Times New Roman"/>
+          <w:sz w:val="26"/>
+          <w:szCs w:val="26"/>
+        </w:rPr>
+        <w:t xml:space="preserve">Đọc yêu cầu ở đầu khung, ví dụ “Hãy kéo các đỉnh để tạo thành </w:t>
+      </w:r>
+      <w:r>
+        <w:rPr>
+          <w:rFonts w:ascii="Times New Roman" w:cs="Times New Roman" w:eastAsia="Times New Roman" w:hAnsi="Times New Roman"/>
+          <w:b/>
+          <w:bCs/>
+          <w:sz w:val="26"/>
+          <w:szCs w:val="26"/>
+        </w:rPr>
+        <w:t xml:space="preserve">HÌNH THANG</w:t>
+      </w:r>
+      <w:r>
+        <w:rPr>
+          <w:rFonts w:ascii="Times New Roman" w:cs="Times New Roman" w:eastAsia="Times New Roman" w:hAnsi="Times New Roman"/>
+          <w:sz w:val="26"/>
+          <w:szCs w:val="26"/>
+        </w:rPr>
+        <w:t xml:space="preserve">”. Ngay dưới là định nghĩa của hình đó.</w:t>
+      </w:r>
+    </w:p>
+    <w:p>
+      <w:pPr>
+        <w:pStyle w:val="ListParagraph"/>
+        <w:numPr>
+          <w:ilvl w:val="0"/>
+          <w:numId w:val="4"/>
+        </w:numPr>
+        <w:spacing w:after="60" w:line="300"/>
+      </w:pPr>
+      <w:r>
+        <w:rPr>
+          <w:rFonts w:ascii="Times New Roman" w:cs="Times New Roman" w:eastAsia="Times New Roman" w:hAnsi="Times New Roman"/>
+          <w:sz w:val="26"/>
+          <w:szCs w:val="26"/>
+        </w:rPr>
+        <w:t xml:space="preserve">Kéo từng đỉnh. Đỉnh luôn dính vào giao điểm của lưới, nên dễ tạo cạnh song song, cạnh bằng nhau hay góc vuông. Trên hình có ghi độ dài từng cạnh, số đo từng góc, ký hiệu góc vuông và hai đường chéo (có thể tắt bằng ô “Hiện đường chéo”).</w:t>
+      </w:r>
+    </w:p>
+    <w:p>
+      <w:pPr>
+        <w:pStyle w:val="ListParagraph"/>
+        <w:numPr>
+          <w:ilvl w:val="0"/>
+          <w:numId w:val="4"/>
+        </w:numPr>
+        <w:spacing w:after="60" w:line="300"/>
+      </w:pPr>
+      <w:r>
+        <w:rPr>
+          <w:rFonts w:ascii="Times New Roman" w:cs="Times New Roman" w:eastAsia="Times New Roman" w:hAnsi="Times New Roman"/>
+          <w:sz w:val="26"/>
+          <w:szCs w:val="26"/>
+        </w:rPr>
+        <w:t xml:space="preserve">Trong lúc kéo, cặp cạnh song song được tô màu: </w:t>
+      </w:r>
+      <w:r>
+        <w:rPr>
+          <w:rFonts w:ascii="Times New Roman" w:cs="Times New Roman" w:eastAsia="Times New Roman" w:hAnsi="Times New Roman"/>
+          <w:b/>
+          <w:bCs/>
+          <w:sz w:val="26"/>
+          <w:szCs w:val="26"/>
+        </w:rPr>
+        <w:t xml:space="preserve">xanh dương</w:t>
+      </w:r>
+      <w:r>
+        <w:rPr>
+          <w:rFonts w:ascii="Times New Roman" w:cs="Times New Roman" w:eastAsia="Times New Roman" w:hAnsi="Times New Roman"/>
+          <w:sz w:val="26"/>
+          <w:szCs w:val="26"/>
+        </w:rPr>
+        <w:t xml:space="preserve"> là AB ∥ CD, </w:t>
+      </w:r>
+      <w:r>
+        <w:rPr>
+          <w:rFonts w:ascii="Times New Roman" w:cs="Times New Roman" w:eastAsia="Times New Roman" w:hAnsi="Times New Roman"/>
+          <w:b/>
+          <w:bCs/>
+          <w:sz w:val="26"/>
+          <w:szCs w:val="26"/>
+        </w:rPr>
+        <w:t xml:space="preserve">xanh lá</w:t>
+      </w:r>
+      <w:r>
+        <w:rPr>
+          <w:rFonts w:ascii="Times New Roman" w:cs="Times New Roman" w:eastAsia="Times New Roman" w:hAnsi="Times New Roman"/>
+          <w:sz w:val="26"/>
+          <w:szCs w:val="26"/>
+        </w:rPr>
+        <w:t xml:space="preserve"> là BC ∥ DA. Khung “Tính chất hiện tại” bên phải đánh dấu ✓ những tính chất tứ giác đang có, khung “Neo4j suy luận” cho biết Neo4j đang áp dụng dấu hiệu nào.</w:t>
+      </w:r>
+    </w:p>
+    <w:p>
+      <w:pPr>
+        <w:pStyle w:val="ListParagraph"/>
+        <w:numPr>
+          <w:ilvl w:val="0"/>
+          <w:numId w:val="4"/>
+        </w:numPr>
+        <w:spacing w:after="60" w:line="300"/>
+      </w:pPr>
+      <w:r>
+        <w:rPr>
+          <w:rFonts w:ascii="Times New Roman" w:cs="Times New Roman" w:eastAsia="Times New Roman" w:hAnsi="Times New Roman"/>
+          <w:sz w:val="26"/>
+          <w:szCs w:val="26"/>
+        </w:rPr>
+        <w:t xml:space="preserve">Thả chuột để nộp. Nếu Neo4j kết luận đúng hình được yêu cầu thì hiện bảng “Chính xác!” kèm số điểm và lý do. Bấm </w:t>
+      </w:r>
+      <w:r>
+        <w:rPr>
+          <w:rFonts w:ascii="Times New Roman" w:cs="Times New Roman" w:eastAsia="Times New Roman" w:hAnsi="Times New Roman"/>
+          <w:b/>
+          <w:bCs/>
+          <w:sz w:val="26"/>
+          <w:szCs w:val="26"/>
+        </w:rPr>
+        <w:t xml:space="preserve">Thử thách tiếp theo</w:t>
+      </w:r>
+      <w:r>
+        <w:rPr>
+          <w:rFonts w:ascii="Times New Roman" w:cs="Times New Roman" w:eastAsia="Times New Roman" w:hAnsi="Times New Roman"/>
+          <w:sz w:val="26"/>
+          <w:szCs w:val="26"/>
+        </w:rPr>
+        <w:t xml:space="preserve"> để chơi tiếp.</w:t>
       </w:r>
     </w:p>
     <w:p>
@@ -3033,9 +3181,9 @@
       <w:r>
         <w:drawing>
           <wp:inline distT="0" distB="0" distL="0" distR="0">
-            <wp:extent cx="5715000" cy="4933950"/>
+            <wp:extent cx="5715000" cy="4181475"/>
             <wp:effectExtent t="0" r="0" b="0" l="0"/>
-            <wp:docPr id="1" name="09a_do_thi_so_do.png" descr="Thống kê đồ thị và sơ đồ phân cấp" title="Thống kê đồ thị và sơ đồ phân cấp"/>
+            <wp:docPr id="1" name="18_thu_thach_chinh_xac.png" descr="Kéo xong hình thang: Neo4j xác nhận và cộng điểm" title="Kéo xong hình thang: Neo4j xác nhận và cộng điểm"/>
             <wp:cNvGraphicFramePr>
               <a:graphicFrameLocks xmlns:a="http://schemas.openxmlformats.org/drawingml/2006/main" noChangeAspect="1"/>
             </wp:cNvGraphicFramePr>
@@ -3058,7 +3206,7 @@
                   <pic:spPr bwMode="auto">
                     <a:xfrm>
                       <a:off x="0" y="0"/>
-                      <a:ext cx="5715000" cy="4933950"/>
+                      <a:ext cx="5715000" cy="4181475"/>
                     </a:xfrm>
                     <a:prstGeom prst="rect">
                       <a:avLst/>
@@ -3084,7 +3232,33 @@
           <w:sz w:val="22"/>
           <w:szCs w:val="22"/>
         </w:rPr>
-        <w:t xml:space="preserve">Hình 13. Thống kê đồ thị và sơ đồ phân cấp</w:t>
+        <w:t xml:space="preserve">Hình 13. Kéo xong hình thang: Neo4j xác nhận và cộng điểm</w:t>
+      </w:r>
+    </w:p>
+    <w:p>
+      <w:pPr>
+        <w:pStyle w:val="Heading2"/>
+        <w:spacing w:after="120" w:before="240"/>
+      </w:pPr>
+      <w:r>
+        <w:rPr>
+          <w:rFonts w:ascii="Times New Roman" w:cs="Times New Roman" w:eastAsia="Times New Roman" w:hAnsi="Times New Roman"/>
+        </w:rPr>
+        <w:t xml:space="preserve">5.2. Gần đúng, gợi ý và các nút</w:t>
+      </w:r>
+    </w:p>
+    <w:p>
+      <w:pPr>
+        <w:spacing w:after="120" w:line="312"/>
+        <w:jc w:val="both"/>
+      </w:pPr>
+      <w:r>
+        <w:rPr>
+          <w:rFonts w:ascii="Times New Roman" w:cs="Times New Roman" w:eastAsia="Times New Roman" w:hAnsi="Times New Roman"/>
+          <w:sz w:val="26"/>
+          <w:szCs w:val="26"/>
+        </w:rPr>
+        <w:t xml:space="preserve">Nếu hình vừa tạo là trường hợp đặc biệt của hình được yêu cầu thì chưa được tính điểm. Ví dụ đề yêu cầu hình thang vuông mà người chơi kéo ra hình chữ nhật, dòng thông báo màu cam sẽ ghi: “Gần đúng! Đây là Hình chữ nhật — một trường hợp đặc biệt của Hình thang vuông…”. Chỉ cần kéo lệch một đỉnh để hình chỉ còn là hình thang vuông.</w:t>
       </w:r>
     </w:p>
     <w:p>
@@ -3095,9 +3269,9 @@
       <w:r>
         <w:drawing>
           <wp:inline distT="0" distB="0" distL="0" distR="0">
-            <wp:extent cx="3895725" cy="7620000"/>
+            <wp:extent cx="5334000" cy="6638925"/>
             <wp:effectExtent t="0" r="0" b="0" l="0"/>
-            <wp:docPr id="1" name="09b_do_thi_dau_hieu.png" descr="Bảng dấu hiệu nhận biết và truy vấn mẫu" title="Bảng dấu hiệu nhận biết và truy vấn mẫu"/>
+            <wp:docPr id="1" name="19_thu_thach_goi_y_gan_dung.png" descr="Đã mở gợi ý và kéo ra hình chữ nhật: thông báo “Gần đúng”" title="Đã mở gợi ý và kéo ra hình chữ nhật: thông báo “Gần đúng”"/>
             <wp:cNvGraphicFramePr>
               <a:graphicFrameLocks xmlns:a="http://schemas.openxmlformats.org/drawingml/2006/main" noChangeAspect="1"/>
             </wp:cNvGraphicFramePr>
@@ -3120,7 +3294,7 @@
                   <pic:spPr bwMode="auto">
                     <a:xfrm>
                       <a:off x="0" y="0"/>
-                      <a:ext cx="3895725" cy="7620000"/>
+                      <a:ext cx="5334000" cy="6638925"/>
                     </a:xfrm>
                     <a:prstGeom prst="rect">
                       <a:avLst/>
@@ -3146,7 +3320,376 @@
           <w:sz w:val="22"/>
           <w:szCs w:val="22"/>
         </w:rPr>
-        <w:t xml:space="preserve">Hình 14. Bảng dấu hiệu nhận biết và truy vấn mẫu</w:t>
+        <w:t xml:space="preserve">Hình 14. Đã mở gợi ý và kéo ra hình chữ nhật: thông báo “Gần đúng”</w:t>
+      </w:r>
+    </w:p>
+    <w:tbl>
+      <w:tblPr>
+        <w:tblW w:type="dxa" w:w="9071"/>
+        <w:tblBorders>
+          <w:top w:val="single" w:color="auto" w:sz="4"/>
+          <w:left w:val="single" w:color="auto" w:sz="4"/>
+          <w:bottom w:val="single" w:color="auto" w:sz="4"/>
+          <w:right w:val="single" w:color="auto" w:sz="4"/>
+          <w:insideH w:val="single" w:color="auto" w:sz="4"/>
+          <w:insideV w:val="single" w:color="auto" w:sz="4"/>
+        </w:tblBorders>
+      </w:tblPr>
+      <w:tblGrid>
+        <w:gridCol w:w="2721"/>
+        <w:gridCol w:w="6350"/>
+      </w:tblGrid>
+      <w:tr>
+        <w:trPr>
+          <w:tblHeader/>
+        </w:trPr>
+        <w:tc>
+          <w:tcPr>
+            <w:tcW w:type="dxa" w:w="2721"/>
+            <w:tcBorders>
+              <w:top w:val="single" w:color="B8C0CC" w:sz="4"/>
+              <w:left w:val="single" w:color="B8C0CC" w:sz="4"/>
+              <w:bottom w:val="single" w:color="B8C0CC" w:sz="4"/>
+              <w:right w:val="single" w:color="B8C0CC" w:sz="4"/>
+            </w:tcBorders>
+            <w:shd w:fill="DCE6FA" w:color="auto" w:val="clear"/>
+            <w:tcMar>
+              <w:top w:type="dxa" w:w="60"/>
+              <w:left w:type="dxa" w:w="100"/>
+              <w:bottom w:type="dxa" w:w="60"/>
+              <w:right w:type="dxa" w:w="100"/>
+            </w:tcMar>
+          </w:tcPr>
+          <w:p>
+            <w:pPr>
+              <w:spacing w:after="0" w:line="276"/>
+            </w:pPr>
+            <w:r>
+              <w:rPr>
+                <w:rFonts w:ascii="Times New Roman" w:cs="Times New Roman" w:eastAsia="Times New Roman" w:hAnsi="Times New Roman"/>
+                <w:b/>
+                <w:bCs/>
+                <w:sz w:val="22"/>
+                <w:szCs w:val="22"/>
+              </w:rPr>
+              <w:t xml:space="preserve">Nút</w:t>
+            </w:r>
+          </w:p>
+        </w:tc>
+        <w:tc>
+          <w:tcPr>
+            <w:tcW w:type="dxa" w:w="6350"/>
+            <w:tcBorders>
+              <w:top w:val="single" w:color="B8C0CC" w:sz="4"/>
+              <w:left w:val="single" w:color="B8C0CC" w:sz="4"/>
+              <w:bottom w:val="single" w:color="B8C0CC" w:sz="4"/>
+              <w:right w:val="single" w:color="B8C0CC" w:sz="4"/>
+            </w:tcBorders>
+            <w:shd w:fill="DCE6FA" w:color="auto" w:val="clear"/>
+            <w:tcMar>
+              <w:top w:type="dxa" w:w="60"/>
+              <w:left w:type="dxa" w:w="100"/>
+              <w:bottom w:type="dxa" w:w="60"/>
+              <w:right w:type="dxa" w:w="100"/>
+            </w:tcMar>
+          </w:tcPr>
+          <w:p>
+            <w:pPr>
+              <w:spacing w:after="0" w:line="276"/>
+            </w:pPr>
+            <w:r>
+              <w:rPr>
+                <w:rFonts w:ascii="Times New Roman" w:cs="Times New Roman" w:eastAsia="Times New Roman" w:hAnsi="Times New Roman"/>
+                <w:b/>
+                <w:bCs/>
+                <w:sz w:val="22"/>
+                <w:szCs w:val="22"/>
+              </w:rPr>
+              <w:t xml:space="preserve">Tác dụng</w:t>
+            </w:r>
+          </w:p>
+        </w:tc>
+      </w:tr>
+      <w:tr>
+        <w:tc>
+          <w:tcPr>
+            <w:tcW w:type="dxa" w:w="2721"/>
+            <w:tcBorders>
+              <w:top w:val="single" w:color="B8C0CC" w:sz="4"/>
+              <w:left w:val="single" w:color="B8C0CC" w:sz="4"/>
+              <w:bottom w:val="single" w:color="B8C0CC" w:sz="4"/>
+              <w:right w:val="single" w:color="B8C0CC" w:sz="4"/>
+            </w:tcBorders>
+            <w:tcMar>
+              <w:top w:type="dxa" w:w="60"/>
+              <w:left w:type="dxa" w:w="100"/>
+              <w:bottom w:type="dxa" w:w="60"/>
+              <w:right w:type="dxa" w:w="100"/>
+            </w:tcMar>
+          </w:tcPr>
+          <w:p>
+            <w:pPr>
+              <w:spacing w:after="0" w:line="276"/>
+            </w:pPr>
+            <w:r>
+              <w:rPr>
+                <w:rFonts w:ascii="Times New Roman" w:cs="Times New Roman" w:eastAsia="Times New Roman" w:hAnsi="Times New Roman"/>
+                <w:b w:val="false"/>
+                <w:bCs w:val="false"/>
+                <w:sz w:val="22"/>
+                <w:szCs w:val="22"/>
+              </w:rPr>
+              <w:t xml:space="preserve">Gợi ý (−50% điểm)</w:t>
+            </w:r>
+          </w:p>
+        </w:tc>
+        <w:tc>
+          <w:tcPr>
+            <w:tcW w:type="dxa" w:w="6350"/>
+            <w:tcBorders>
+              <w:top w:val="single" w:color="B8C0CC" w:sz="4"/>
+              <w:left w:val="single" w:color="B8C0CC" w:sz="4"/>
+              <w:bottom w:val="single" w:color="B8C0CC" w:sz="4"/>
+              <w:right w:val="single" w:color="B8C0CC" w:sz="4"/>
+            </w:tcBorders>
+            <w:tcMar>
+              <w:top w:type="dxa" w:w="60"/>
+              <w:left w:type="dxa" w:w="100"/>
+              <w:bottom w:type="dxa" w:w="60"/>
+              <w:right w:type="dxa" w:w="100"/>
+            </w:tcMar>
+          </w:tcPr>
+          <w:p>
+            <w:pPr>
+              <w:spacing w:after="0" w:line="276"/>
+            </w:pPr>
+            <w:r>
+              <w:rPr>
+                <w:rFonts w:ascii="Times New Roman" w:cs="Times New Roman" w:eastAsia="Times New Roman" w:hAnsi="Times New Roman"/>
+                <w:b w:val="false"/>
+                <w:bCs w:val="false"/>
+                <w:sz w:val="22"/>
+                <w:szCs w:val="22"/>
+              </w:rPr>
+              <w:t xml:space="preserve">Hiện các dấu hiệu nhận biết của hình cần tạo, lấy từ các nút :DauHieu trong Neo4j. Thử thách đó chỉ được một nửa số điểm.</w:t>
+            </w:r>
+          </w:p>
+        </w:tc>
+      </w:tr>
+      <w:tr>
+        <w:tc>
+          <w:tcPr>
+            <w:tcW w:type="dxa" w:w="2721"/>
+            <w:tcBorders>
+              <w:top w:val="single" w:color="B8C0CC" w:sz="4"/>
+              <w:left w:val="single" w:color="B8C0CC" w:sz="4"/>
+              <w:bottom w:val="single" w:color="B8C0CC" w:sz="4"/>
+              <w:right w:val="single" w:color="B8C0CC" w:sz="4"/>
+            </w:tcBorders>
+            <w:tcMar>
+              <w:top w:type="dxa" w:w="60"/>
+              <w:left w:type="dxa" w:w="100"/>
+              <w:bottom w:type="dxa" w:w="60"/>
+              <w:right w:type="dxa" w:w="100"/>
+            </w:tcMar>
+          </w:tcPr>
+          <w:p>
+            <w:pPr>
+              <w:spacing w:after="0" w:line="276"/>
+            </w:pPr>
+            <w:r>
+              <w:rPr>
+                <w:rFonts w:ascii="Times New Roman" w:cs="Times New Roman" w:eastAsia="Times New Roman" w:hAnsi="Times New Roman"/>
+                <w:b w:val="false"/>
+                <w:bCs w:val="false"/>
+                <w:sz w:val="22"/>
+                <w:szCs w:val="22"/>
+              </w:rPr>
+              <w:t xml:space="preserve">Hình mới</w:t>
+            </w:r>
+          </w:p>
+        </w:tc>
+        <w:tc>
+          <w:tcPr>
+            <w:tcW w:type="dxa" w:w="6350"/>
+            <w:tcBorders>
+              <w:top w:val="single" w:color="B8C0CC" w:sz="4"/>
+              <w:left w:val="single" w:color="B8C0CC" w:sz="4"/>
+              <w:bottom w:val="single" w:color="B8C0CC" w:sz="4"/>
+              <w:right w:val="single" w:color="B8C0CC" w:sz="4"/>
+            </w:tcBorders>
+            <w:tcMar>
+              <w:top w:type="dxa" w:w="60"/>
+              <w:left w:type="dxa" w:w="100"/>
+              <w:bottom w:type="dxa" w:w="60"/>
+              <w:right w:type="dxa" w:w="100"/>
+            </w:tcMar>
+          </w:tcPr>
+          <w:p>
+            <w:pPr>
+              <w:spacing w:after="0" w:line="276"/>
+            </w:pPr>
+            <w:r>
+              <w:rPr>
+                <w:rFonts w:ascii="Times New Roman" w:cs="Times New Roman" w:eastAsia="Times New Roman" w:hAnsi="Times New Roman"/>
+                <w:b w:val="false"/>
+                <w:bCs w:val="false"/>
+                <w:sz w:val="22"/>
+                <w:szCs w:val="22"/>
+              </w:rPr>
+              <w:t xml:space="preserve">Đổi sang một tứ giác thường khác để kéo lại từ đầu.</w:t>
+            </w:r>
+          </w:p>
+        </w:tc>
+      </w:tr>
+      <w:tr>
+        <w:tc>
+          <w:tcPr>
+            <w:tcW w:type="dxa" w:w="2721"/>
+            <w:tcBorders>
+              <w:top w:val="single" w:color="B8C0CC" w:sz="4"/>
+              <w:left w:val="single" w:color="B8C0CC" w:sz="4"/>
+              <w:bottom w:val="single" w:color="B8C0CC" w:sz="4"/>
+              <w:right w:val="single" w:color="B8C0CC" w:sz="4"/>
+            </w:tcBorders>
+            <w:tcMar>
+              <w:top w:type="dxa" w:w="60"/>
+              <w:left w:type="dxa" w:w="100"/>
+              <w:bottom w:type="dxa" w:w="60"/>
+              <w:right w:type="dxa" w:w="100"/>
+            </w:tcMar>
+          </w:tcPr>
+          <w:p>
+            <w:pPr>
+              <w:spacing w:after="0" w:line="276"/>
+            </w:pPr>
+            <w:r>
+              <w:rPr>
+                <w:rFonts w:ascii="Times New Roman" w:cs="Times New Roman" w:eastAsia="Times New Roman" w:hAnsi="Times New Roman"/>
+                <w:b w:val="false"/>
+                <w:bCs w:val="false"/>
+                <w:sz w:val="22"/>
+                <w:szCs w:val="22"/>
+              </w:rPr>
+              <w:t xml:space="preserve">Bỏ qua</w:t>
+            </w:r>
+          </w:p>
+        </w:tc>
+        <w:tc>
+          <w:tcPr>
+            <w:tcW w:type="dxa" w:w="6350"/>
+            <w:tcBorders>
+              <w:top w:val="single" w:color="B8C0CC" w:sz="4"/>
+              <w:left w:val="single" w:color="B8C0CC" w:sz="4"/>
+              <w:bottom w:val="single" w:color="B8C0CC" w:sz="4"/>
+              <w:right w:val="single" w:color="B8C0CC" w:sz="4"/>
+            </w:tcBorders>
+            <w:tcMar>
+              <w:top w:type="dxa" w:w="60"/>
+              <w:left w:type="dxa" w:w="100"/>
+              <w:bottom w:type="dxa" w:w="60"/>
+              <w:right w:type="dxa" w:w="100"/>
+            </w:tcMar>
+          </w:tcPr>
+          <w:p>
+            <w:pPr>
+              <w:spacing w:after="0" w:line="276"/>
+            </w:pPr>
+            <w:r>
+              <w:rPr>
+                <w:rFonts w:ascii="Times New Roman" w:cs="Times New Roman" w:eastAsia="Times New Roman" w:hAnsi="Times New Roman"/>
+                <w:b w:val="false"/>
+                <w:bCs w:val="false"/>
+                <w:sz w:val="22"/>
+                <w:szCs w:val="22"/>
+              </w:rPr>
+              <w:t xml:space="preserve">Sang thử thách tiếp theo, không được điểm và chuỗi đúng trở về 0.</w:t>
+            </w:r>
+          </w:p>
+        </w:tc>
+      </w:tr>
+      <w:tr>
+        <w:tc>
+          <w:tcPr>
+            <w:tcW w:type="dxa" w:w="2721"/>
+            <w:tcBorders>
+              <w:top w:val="single" w:color="B8C0CC" w:sz="4"/>
+              <w:left w:val="single" w:color="B8C0CC" w:sz="4"/>
+              <w:bottom w:val="single" w:color="B8C0CC" w:sz="4"/>
+              <w:right w:val="single" w:color="B8C0CC" w:sz="4"/>
+            </w:tcBorders>
+            <w:tcMar>
+              <w:top w:type="dxa" w:w="60"/>
+              <w:left w:type="dxa" w:w="100"/>
+              <w:bottom w:type="dxa" w:w="60"/>
+              <w:right w:type="dxa" w:w="100"/>
+            </w:tcMar>
+          </w:tcPr>
+          <w:p>
+            <w:pPr>
+              <w:spacing w:after="0" w:line="276"/>
+            </w:pPr>
+            <w:r>
+              <w:rPr>
+                <w:rFonts w:ascii="Times New Roman" w:cs="Times New Roman" w:eastAsia="Times New Roman" w:hAnsi="Times New Roman"/>
+                <w:b w:val="false"/>
+                <w:bCs w:val="false"/>
+                <w:sz w:val="22"/>
+                <w:szCs w:val="22"/>
+              </w:rPr>
+              <w:t xml:space="preserve">Kết thúc &amp; lưu điểm</w:t>
+            </w:r>
+          </w:p>
+        </w:tc>
+        <w:tc>
+          <w:tcPr>
+            <w:tcW w:type="dxa" w:w="6350"/>
+            <w:tcBorders>
+              <w:top w:val="single" w:color="B8C0CC" w:sz="4"/>
+              <w:left w:val="single" w:color="B8C0CC" w:sz="4"/>
+              <w:bottom w:val="single" w:color="B8C0CC" w:sz="4"/>
+              <w:right w:val="single" w:color="B8C0CC" w:sz="4"/>
+            </w:tcBorders>
+            <w:tcMar>
+              <w:top w:type="dxa" w:w="60"/>
+              <w:left w:type="dxa" w:w="100"/>
+              <w:bottom w:type="dxa" w:w="60"/>
+              <w:right w:type="dxa" w:w="100"/>
+            </w:tcMar>
+          </w:tcPr>
+          <w:p>
+            <w:pPr>
+              <w:spacing w:after="0" w:line="276"/>
+            </w:pPr>
+            <w:r>
+              <w:rPr>
+                <w:rFonts w:ascii="Times New Roman" w:cs="Times New Roman" w:eastAsia="Times New Roman" w:hAnsi="Times New Roman"/>
+                <w:b w:val="false"/>
+                <w:bCs w:val="false"/>
+                <w:sz w:val="22"/>
+                <w:szCs w:val="22"/>
+              </w:rPr>
+              <w:t xml:space="preserve">Dừng chơi, nhập tên và lưu điểm vào bảng xếp hạng.</w:t>
+            </w:r>
+          </w:p>
+        </w:tc>
+      </w:tr>
+    </w:tbl>
+    <w:p>
+      <w:pPr>
+        <w:spacing w:after="120"/>
+      </w:pPr>
+    </w:p>
+    <w:p>
+      <w:pPr>
+        <w:pStyle w:val="Heading2"/>
+        <w:spacing w:after="120" w:before="240"/>
+      </w:pPr>
+      <w:r>
+        <w:rPr>
+          <w:rFonts w:ascii="Times New Roman" w:cs="Times New Roman" w:eastAsia="Times New Roman" w:hAnsi="Times New Roman"/>
+        </w:rPr>
+        <w:t xml:space="preserve">5.3. Cách tính điểm và bảng xếp hạng</w:t>
       </w:r>
     </w:p>
     <w:p>
@@ -3160,7 +3703,71 @@
           <w:sz w:val="26"/>
           <w:szCs w:val="26"/>
         </w:rPr>
-        <w:t xml:space="preserve">Bấm vào một hình trên sơ đồ để mở trang tra cứu hình đó. Trang tra cứu có định nghĩa, hình cha và hình con, các dấu hiệu nhận biết, những hình có thể suy ra tiếp, toàn bộ tính chất (tính chất riêng được in đậm, còn lại ghi rõ kế thừa từ hình nào) và bảng công thức kèm hình vẽ minh hoạ.</w:t>
+        <w:t xml:space="preserve">Mỗi thử thách làm đúng được 100 điểm, cộng thêm điểm tốc độ (tối đa 60, giảm 1 điểm mỗi giây) và điểm chuỗi (thêm 10 điểm cho mỗi thử thách đúng liên tiếp, tối đa 50). Nếu đã bấm Gợi ý thì điểm của thử thách đó chia đôi.</w:t>
+      </w:r>
+    </w:p>
+    <w:p>
+      <w:pPr>
+        <w:spacing w:after="120" w:line="312"/>
+        <w:jc w:val="both"/>
+      </w:pPr>
+      <w:r>
+        <w:rPr>
+          <w:rFonts w:ascii="Times New Roman" w:cs="Times New Roman" w:eastAsia="Times New Roman" w:hAnsi="Times New Roman"/>
+          <w:sz w:val="26"/>
+          <w:szCs w:val="26"/>
+        </w:rPr>
+        <w:t xml:space="preserve">Làm xong 8 thử thách, bảng “Hoàn thành vòng” hiện ra. Nhập tên rồi bấm </w:t>
+      </w:r>
+      <w:r>
+        <w:rPr>
+          <w:rFonts w:ascii="Times New Roman" w:cs="Times New Roman" w:eastAsia="Times New Roman" w:hAnsi="Times New Roman"/>
+          <w:b/>
+          <w:bCs/>
+          <w:sz w:val="26"/>
+          <w:szCs w:val="26"/>
+        </w:rPr>
+        <w:t xml:space="preserve">Lưu điểm</w:t>
+      </w:r>
+      <w:r>
+        <w:rPr>
+          <w:rFonts w:ascii="Times New Roman" w:cs="Times New Roman" w:eastAsia="Times New Roman" w:hAnsi="Times New Roman"/>
+          <w:sz w:val="26"/>
+          <w:szCs w:val="26"/>
+        </w:rPr>
+        <w:t xml:space="preserve">: điểm được lưu vào Neo4j dưới dạng nút </w:t>
+      </w:r>
+      <w:r>
+        <w:rPr>
+          <w:rFonts w:ascii="Consolas" w:cs="Consolas" w:eastAsia="Consolas" w:hAnsi="Consolas"/>
+          <w:sz w:val="20"/>
+          <w:szCs w:val="20"/>
+        </w:rPr>
+        <w:t xml:space="preserve">:LuotChoi</w:t>
+      </w:r>
+      <w:r>
+        <w:rPr>
+          <w:rFonts w:ascii="Times New Roman" w:cs="Times New Roman" w:eastAsia="Times New Roman" w:hAnsi="Times New Roman"/>
+          <w:sz w:val="26"/>
+          <w:szCs w:val="26"/>
+        </w:rPr>
+        <w:t xml:space="preserve"> nối tới các hình đã tạo đúng bằng quan hệ </w:t>
+      </w:r>
+      <w:r>
+        <w:rPr>
+          <w:rFonts w:ascii="Consolas" w:cs="Consolas" w:eastAsia="Consolas" w:hAnsi="Consolas"/>
+          <w:sz w:val="20"/>
+          <w:szCs w:val="20"/>
+        </w:rPr>
+        <w:t xml:space="preserve">:HOAN_THANH</w:t>
+      </w:r>
+      <w:r>
+        <w:rPr>
+          <w:rFonts w:ascii="Times New Roman" w:cs="Times New Roman" w:eastAsia="Times New Roman" w:hAnsi="Times New Roman"/>
+          <w:sz w:val="26"/>
+          <w:szCs w:val="26"/>
+        </w:rPr>
+        <w:t xml:space="preserve">. Bảng xếp hạng bên phải hiện 10 lượt chơi điểm cao nhất. Bấm “Chơi vòng mới” để chơi tiếp với thứ tự thử thách được xáo trộn.</w:t>
       </w:r>
     </w:p>
     <w:p>
@@ -3171,9 +3778,9 @@
       <w:r>
         <w:drawing>
           <wp:inline distT="0" distB="0" distL="0" distR="0">
-            <wp:extent cx="4438650" cy="6667500"/>
+            <wp:extent cx="5334000" cy="7038975"/>
             <wp:effectExtent t="0" r="0" b="0" l="0"/>
-            <wp:docPr id="1" name="10_tra_cuu_hinh_vuong.png" descr="Trang tra cứu Hình vuông" title="Trang tra cứu Hình vuông"/>
+            <wp:docPr id="1" name="20_thu_thach_bang_xep_hang.png" descr="Hoàn thành vòng 1, lưu điểm và bảng xếp hạng" title="Hoàn thành vòng 1, lưu điểm và bảng xếp hạng"/>
             <wp:cNvGraphicFramePr>
               <a:graphicFrameLocks xmlns:a="http://schemas.openxmlformats.org/drawingml/2006/main" noChangeAspect="1"/>
             </wp:cNvGraphicFramePr>
@@ -3196,7 +3803,7 @@
                   <pic:spPr bwMode="auto">
                     <a:xfrm>
                       <a:off x="0" y="0"/>
-                      <a:ext cx="4438650" cy="6667500"/>
+                      <a:ext cx="5334000" cy="7038975"/>
                     </a:xfrm>
                     <a:prstGeom prst="rect">
                       <a:avLst/>
@@ -3222,31 +3829,7 @@
           <w:sz w:val="22"/>
           <w:szCs w:val="22"/>
         </w:rPr>
-        <w:t xml:space="preserve">Hình 15. Trang tra cứu Hình vuông</w:t>
-      </w:r>
-    </w:p>
-    <w:p>
-      <w:pPr>
-        <w:pStyle w:val="Heading1"/>
-        <w:spacing w:after="160" w:before="360"/>
-      </w:pPr>
-      <w:r>
-        <w:rPr>
-          <w:rFonts w:ascii="Times New Roman" w:cs="Times New Roman" w:eastAsia="Times New Roman" w:hAnsi="Times New Roman"/>
-        </w:rPr>
-        <w:t xml:space="preserve">7. Dùng trực tiếp trong Neo4j Browser và qua API</w:t>
-      </w:r>
-    </w:p>
-    <w:p>
-      <w:pPr>
-        <w:pStyle w:val="Heading2"/>
-        <w:spacing w:after="120" w:before="240"/>
-      </w:pPr>
-      <w:r>
-        <w:rPr>
-          <w:rFonts w:ascii="Times New Roman" w:cs="Times New Roman" w:eastAsia="Times New Roman" w:hAnsi="Times New Roman"/>
-        </w:rPr>
-        <w:t xml:space="preserve">7.1. Neo4j Browser</w:t>
+        <w:t xml:space="preserve">Hình 15. Hoàn thành vòng 1, lưu điểm và bảng xếp hạng</w:t>
       </w:r>
     </w:p>
     <w:p>
@@ -3260,25 +3843,7 @@
           <w:sz w:val="26"/>
           <w:szCs w:val="26"/>
         </w:rPr>
-        <w:t xml:space="preserve">Mở </w:t>
-      </w:r>
-      <w:r>
-        <w:rPr>
-          <w:rFonts w:ascii="Times New Roman" w:cs="Times New Roman" w:eastAsia="Times New Roman" w:hAnsi="Times New Roman"/>
-          <w:b/>
-          <w:bCs/>
-          <w:sz w:val="26"/>
-          <w:szCs w:val="26"/>
-        </w:rPr>
-        <w:t xml:space="preserve">http://localhost:7474</w:t>
-      </w:r>
-      <w:r>
-        <w:rPr>
-          <w:rFonts w:ascii="Times New Roman" w:cs="Times New Roman" w:eastAsia="Times New Roman" w:hAnsi="Times New Roman"/>
-          <w:sz w:val="26"/>
-          <w:szCs w:val="26"/>
-        </w:rPr>
-        <w:t xml:space="preserve"> và đăng nhập bằng neo4j / matkhau123. Gõ câu lệnh vào ô ở trên cùng rồi nhấn Ctrl + Enter. Ví dụ, xem sơ đồ phân cấp:</w:t>
+        <w:t xml:space="preserve">Xem các lượt chơi đã lưu trong Neo4j Browser:</w:t>
       </w:r>
     </w:p>
     <w:p>
@@ -3296,7 +3861,7 @@
           <w:sz w:val="19"/>
           <w:szCs w:val="19"/>
         </w:rPr>
-        <w:t xml:space="preserve">MATCH p = (:Hinh)-[:LA_MOT]-&gt;(:Hinh) RETURN p</w:t>
+        <w:t xml:space="preserve">MATCH p = (:LuotChoi)-[:HOAN_THANH]-&gt;(:Hinh) RETURN p</w:t>
       </w:r>
     </w:p>
     <w:p>
@@ -3312,67 +3877,33 @@
       <w:r>
         <w:rPr>
           <w:rFonts w:ascii="Times New Roman" w:cs="Times New Roman" w:eastAsia="Times New Roman" w:hAnsi="Times New Roman"/>
-          <w:sz w:val="26"/>
-          <w:szCs w:val="26"/>
-        </w:rPr>
-        <w:t xml:space="preserve">Các dấu hiệu dẫn tới hình vuông:</w:t>
-      </w:r>
-    </w:p>
-    <w:p>
-      <w:pPr>
-        <w:pBdr>
-          <w:top w:val="single" w:color="D0D5DD" w:sz="4" w:space="4"/>
-        </w:pBdr>
-        <w:shd w:fill="F2F4F7" w:color="auto" w:val="clear"/>
-        <w:spacing w:after="0" w:before="0" w:line="260"/>
-        <w:ind w:left="200" w:right="200"/>
-      </w:pPr>
-      <w:r>
-        <w:rPr>
-          <w:rFonts w:ascii="Consolas" w:cs="Consolas" w:eastAsia="Consolas" w:hAnsi="Consolas"/>
-          <w:sz w:val="19"/>
-          <w:szCs w:val="19"/>
-        </w:rPr>
-        <w:t xml:space="preserve">MATCH p = (:Hinh)&lt;-[:AP_DUNG_CHO]-(d:DauHieu)-[:KET_LUAN]-&gt;(:Hinh {ma:'HINH_VUONG'})</w:t>
-      </w:r>
-    </w:p>
-    <w:p>
-      <w:pPr>
-        <w:shd w:fill="F2F4F7" w:color="auto" w:val="clear"/>
-        <w:spacing w:after="0" w:before="0" w:line="260"/>
-        <w:ind w:left="200" w:right="200"/>
-      </w:pPr>
-      <w:r>
-        <w:rPr>
-          <w:rFonts w:ascii="Consolas" w:cs="Consolas" w:eastAsia="Consolas" w:hAnsi="Consolas"/>
-          <w:sz w:val="19"/>
-          <w:szCs w:val="19"/>
-        </w:rPr>
-        <w:t xml:space="preserve">OPTIONAL MATCH q = (d)-[:CAN]-&gt;(:TinhChat)</w:t>
-      </w:r>
-    </w:p>
-    <w:p>
-      <w:pPr>
-        <w:pBdr>
-          <w:bottom w:val="single" w:color="D0D5DD" w:sz="4" w:space="4"/>
-        </w:pBdr>
-        <w:shd w:fill="F2F4F7" w:color="auto" w:val="clear"/>
-        <w:spacing w:after="0" w:before="0" w:line="260"/>
-        <w:ind w:left="200" w:right="200"/>
-      </w:pPr>
-      <w:r>
-        <w:rPr>
-          <w:rFonts w:ascii="Consolas" w:cs="Consolas" w:eastAsia="Consolas" w:hAnsi="Consolas"/>
-          <w:sz w:val="19"/>
-          <w:szCs w:val="19"/>
-        </w:rPr>
-        <w:t xml:space="preserve">RETURN p, q</w:t>
-      </w:r>
-    </w:p>
-    <w:p>
-      <w:pPr>
-        <w:spacing w:after="80"/>
-      </w:pPr>
+          <w:i/>
+          <w:iCs/>
+          <w:sz w:val="26"/>
+          <w:szCs w:val="26"/>
+        </w:rPr>
+        <w:t xml:space="preserve">Bên trong: </w:t>
+      </w:r>
+      <w:r>
+        <w:rPr>
+          <w:rFonts w:ascii="Times New Roman" w:cs="Times New Roman" w:eastAsia="Times New Roman" w:hAnsi="Times New Roman"/>
+          <w:sz w:val="26"/>
+          <w:szCs w:val="26"/>
+        </w:rPr>
+        <w:t xml:space="preserve">mỗi lần thả chuột, toạ độ 4 đỉnh được gửi tới máy chủ. Mã Python (src\hinh_hoc.py) tính chính xác bằng số nguyên các tính chất như cặp cạnh song song, cạnh bằng nhau, góc vuông, đường chéo cắt nhau tại trung điểm… rồi đưa danh sách tính chất đó vào đúng bộ suy luận của chức năng Nhận dạng. Vì vậy trò chơi dùng chung tri thức với phần nhận dạng.</w:t>
+      </w:r>
+    </w:p>
+    <w:p>
+      <w:pPr>
+        <w:pStyle w:val="Heading1"/>
+        <w:spacing w:after="160" w:before="360"/>
+      </w:pPr>
+      <w:r>
+        <w:rPr>
+          <w:rFonts w:ascii="Times New Roman" w:cs="Times New Roman" w:eastAsia="Times New Roman" w:hAnsi="Times New Roman"/>
+        </w:rPr>
+        <w:t xml:space="preserve">6. Bài toán mẫu</w:t>
+      </w:r>
     </w:p>
     <w:p>
       <w:pPr>
@@ -3385,255 +3916,8 @@
           <w:sz w:val="26"/>
           <w:szCs w:val="26"/>
         </w:rPr>
-        <w:t xml:space="preserve">Mọi tính chất của hình chữ nhật, kể cả tính chất kế thừa:</w:t>
-      </w:r>
-    </w:p>
-    <w:p>
-      <w:pPr>
-        <w:pBdr>
-          <w:top w:val="single" w:color="D0D5DD" w:sz="4" w:space="4"/>
-        </w:pBdr>
-        <w:shd w:fill="F2F4F7" w:color="auto" w:val="clear"/>
-        <w:spacing w:after="0" w:before="0" w:line="260"/>
-        <w:ind w:left="200" w:right="200"/>
-      </w:pPr>
-      <w:r>
-        <w:rPr>
-          <w:rFonts w:ascii="Consolas" w:cs="Consolas" w:eastAsia="Consolas" w:hAnsi="Consolas"/>
-          <w:sz w:val="19"/>
-          <w:szCs w:val="19"/>
-        </w:rPr>
-        <w:t xml:space="preserve">MATCH (:Hinh {ma:'HINH_CHU_NHAT'})-[:LA_MOT*0..]-&gt;(a)-[:CO_TINH_CHAT]-&gt;(t)</w:t>
-      </w:r>
-    </w:p>
-    <w:p>
-      <w:pPr>
-        <w:pBdr>
-          <w:bottom w:val="single" w:color="D0D5DD" w:sz="4" w:space="4"/>
-        </w:pBdr>
-        <w:shd w:fill="F2F4F7" w:color="auto" w:val="clear"/>
-        <w:spacing w:after="0" w:before="0" w:line="260"/>
-        <w:ind w:left="200" w:right="200"/>
-      </w:pPr>
-      <w:r>
-        <w:rPr>
-          <w:rFonts w:ascii="Consolas" w:cs="Consolas" w:eastAsia="Consolas" w:hAnsi="Consolas"/>
-          <w:sz w:val="19"/>
-          <w:szCs w:val="19"/>
-        </w:rPr>
-        <w:t xml:space="preserve">RETURN t.ten AS tinh_chat, collect(DISTINCT a.ten) AS ke_thua_tu</w:t>
-      </w:r>
-    </w:p>
-    <w:p>
-      <w:pPr>
-        <w:spacing w:after="80"/>
-      </w:pPr>
-    </w:p>
-    <w:p>
-      <w:pPr>
-        <w:spacing w:after="120" w:line="312"/>
-        <w:jc w:val="both"/>
-      </w:pPr>
-      <w:r>
-        <w:rPr>
-          <w:rFonts w:ascii="Times New Roman" w:cs="Times New Roman" w:eastAsia="Times New Roman" w:hAnsi="Times New Roman"/>
-          <w:sz w:val="26"/>
-          <w:szCs w:val="26"/>
-        </w:rPr>
-        <w:t xml:space="preserve">Công thức diện tích và chu vi của mọi hình:</w:t>
-      </w:r>
-    </w:p>
-    <w:p>
-      <w:pPr>
-        <w:pBdr>
-          <w:top w:val="single" w:color="D0D5DD" w:sz="4" w:space="4"/>
-        </w:pBdr>
-        <w:shd w:fill="F2F4F7" w:color="auto" w:val="clear"/>
-        <w:spacing w:after="0" w:before="0" w:line="260"/>
-        <w:ind w:left="200" w:right="200"/>
-      </w:pPr>
-      <w:r>
-        <w:rPr>
-          <w:rFonts w:ascii="Consolas" w:cs="Consolas" w:eastAsia="Consolas" w:hAnsi="Consolas"/>
-          <w:sz w:val="19"/>
-          <w:szCs w:val="19"/>
-        </w:rPr>
-        <w:t xml:space="preserve">MATCH (h:Hinh)-[:CO_CONG_THUC]-&gt;(c:CongThuc)</w:t>
-      </w:r>
-    </w:p>
-    <w:p>
-      <w:pPr>
-        <w:shd w:fill="F2F4F7" w:color="auto" w:val="clear"/>
-        <w:spacing w:after="0" w:before="0" w:line="260"/>
-        <w:ind w:left="200" w:right="200"/>
-      </w:pPr>
-      <w:r>
-        <w:rPr>
-          <w:rFonts w:ascii="Consolas" w:cs="Consolas" w:eastAsia="Consolas" w:hAnsi="Consolas"/>
-          <w:sz w:val="19"/>
-          <w:szCs w:val="19"/>
-        </w:rPr>
-        <w:t xml:space="preserve">WHERE c.loai IN ['dien_tich', 'chu_vi']</w:t>
-      </w:r>
-    </w:p>
-    <w:p>
-      <w:pPr>
-        <w:pBdr>
-          <w:bottom w:val="single" w:color="D0D5DD" w:sz="4" w:space="4"/>
-        </w:pBdr>
-        <w:shd w:fill="F2F4F7" w:color="auto" w:val="clear"/>
-        <w:spacing w:after="0" w:before="0" w:line="260"/>
-        <w:ind w:left="200" w:right="200"/>
-      </w:pPr>
-      <w:r>
-        <w:rPr>
-          <w:rFonts w:ascii="Consolas" w:cs="Consolas" w:eastAsia="Consolas" w:hAnsi="Consolas"/>
-          <w:sz w:val="19"/>
-          <w:szCs w:val="19"/>
-        </w:rPr>
-        <w:t xml:space="preserve">RETURN h.ten AS hinh, c.loai_ten AS loai, c.hien_thi AS cong_thuc</w:t>
-      </w:r>
-    </w:p>
-    <w:p>
-      <w:pPr>
-        <w:spacing w:after="80"/>
-      </w:pPr>
-    </w:p>
-    <w:p>
-      <w:pPr>
-        <w:spacing w:after="120" w:line="312"/>
-        <w:jc w:val="both"/>
-      </w:pPr>
-      <w:r>
-        <w:rPr>
-          <w:rFonts w:ascii="Times New Roman" w:cs="Times New Roman" w:eastAsia="Times New Roman" w:hAnsi="Times New Roman"/>
-          <w:sz w:val="26"/>
-          <w:szCs w:val="26"/>
-        </w:rPr>
-        <w:t xml:space="preserve">Đồ thị công thức của hình chữ nhật:</w:t>
-      </w:r>
-    </w:p>
-    <w:p>
-      <w:pPr>
-        <w:pBdr>
-          <w:top w:val="single" w:color="D0D5DD" w:sz="4" w:space="4"/>
-        </w:pBdr>
-        <w:shd w:fill="F2F4F7" w:color="auto" w:val="clear"/>
-        <w:spacing w:after="0" w:before="0" w:line="260"/>
-        <w:ind w:left="200" w:right="200"/>
-      </w:pPr>
-      <w:r>
-        <w:rPr>
-          <w:rFonts w:ascii="Consolas" w:cs="Consolas" w:eastAsia="Consolas" w:hAnsi="Consolas"/>
-          <w:sz w:val="19"/>
-          <w:szCs w:val="19"/>
-        </w:rPr>
-        <w:t xml:space="preserve">MATCH p = (:Hinh {ma:'HINH_CHU_NHAT'})-[:CO_CONG_THUC]-&gt;(:CongThuc)-[:TINH_RA|CAN_BIEN]-&gt;(:DaiLuong)</w:t>
-      </w:r>
-    </w:p>
-    <w:p>
-      <w:pPr>
-        <w:pBdr>
-          <w:bottom w:val="single" w:color="D0D5DD" w:sz="4" w:space="4"/>
-        </w:pBdr>
-        <w:shd w:fill="F2F4F7" w:color="auto" w:val="clear"/>
-        <w:spacing w:after="0" w:before="0" w:line="260"/>
-        <w:ind w:left="200" w:right="200"/>
-      </w:pPr>
-      <w:r>
-        <w:rPr>
-          <w:rFonts w:ascii="Consolas" w:cs="Consolas" w:eastAsia="Consolas" w:hAnsi="Consolas"/>
-          <w:sz w:val="19"/>
-          <w:szCs w:val="19"/>
-        </w:rPr>
-        <w:t xml:space="preserve">RETURN p</w:t>
-      </w:r>
-    </w:p>
-    <w:p>
-      <w:pPr>
-        <w:spacing w:after="80"/>
-      </w:pPr>
-    </w:p>
-    <w:p>
-      <w:pPr>
-        <w:spacing w:after="120" w:line="312"/>
-        <w:jc w:val="both"/>
-      </w:pPr>
-      <w:r>
-        <w:rPr>
-          <w:rFonts w:ascii="Times New Roman" w:cs="Times New Roman" w:eastAsia="Times New Roman" w:hAnsi="Times New Roman"/>
-          <w:sz w:val="26"/>
-          <w:szCs w:val="26"/>
-        </w:rPr>
-        <w:t xml:space="preserve">Thêm nhiều truy vấn khác có trong file cypher\queries.cypher. Nếu không muốn dùng Python, có thể tạo toàn bộ đồ thị bằng cách dán file cypher\seed.cypher vào Neo4j Browser. Trước đó cần bật “Enable multi statement query editor” trong phần Settings của Neo4j Browser.</w:t>
-      </w:r>
-    </w:p>
-    <w:p>
-      <w:pPr>
-        <w:pStyle w:val="Heading2"/>
-        <w:spacing w:after="120" w:before="240"/>
-      </w:pPr>
-      <w:r>
-        <w:rPr>
-          <w:rFonts w:ascii="Times New Roman" w:cs="Times New Roman" w:eastAsia="Times New Roman" w:hAnsi="Times New Roman"/>
-        </w:rPr>
-        <w:t xml:space="preserve">7.2. API JSON</w:t>
-      </w:r>
-    </w:p>
-    <w:p>
-      <w:pPr>
-        <w:spacing w:after="120" w:line="312"/>
-        <w:jc w:val="both"/>
-      </w:pPr>
-      <w:r>
-        <w:rPr>
-          <w:rFonts w:ascii="Times New Roman" w:cs="Times New Roman" w:eastAsia="Times New Roman" w:hAnsi="Times New Roman"/>
-          <w:sz w:val="26"/>
-          <w:szCs w:val="26"/>
-        </w:rPr>
-        <w:t xml:space="preserve">Ứng dụng có thêm API để chương trình khác gọi tới. Ví dụ nhận dạng và tính toán:</w:t>
-      </w:r>
-    </w:p>
-    <w:p>
-      <w:pPr>
-        <w:pBdr>
-          <w:top w:val="single" w:color="D0D5DD" w:sz="4" w:space="4"/>
-        </w:pBdr>
-        <w:shd w:fill="F2F4F7" w:color="auto" w:val="clear"/>
-        <w:spacing w:after="0" w:before="0" w:line="260"/>
-        <w:ind w:left="200" w:right="200"/>
-      </w:pPr>
-      <w:r>
-        <w:rPr>
-          <w:rFonts w:ascii="Consolas" w:cs="Consolas" w:eastAsia="Consolas" w:hAnsi="Consolas"/>
-          <w:sz w:val="19"/>
-          <w:szCs w:val="19"/>
-        </w:rPr>
-        <w:t xml:space="preserve">http://localhost:5000/api/suy-luan?hinh=HINH_BINH_HANH&amp;tc=CHEO_VUONG_GOC&amp;tc=CHEO_BANG</w:t>
-      </w:r>
-    </w:p>
-    <w:p>
-      <w:pPr>
-        <w:pBdr>
-          <w:bottom w:val="single" w:color="D0D5DD" w:sz="4" w:space="4"/>
-        </w:pBdr>
-        <w:shd w:fill="F2F4F7" w:color="auto" w:val="clear"/>
-        <w:spacing w:after="0" w:before="0" w:line="260"/>
-        <w:ind w:left="200" w:right="200"/>
-      </w:pPr>
-      <w:r>
-        <w:rPr>
-          <w:rFonts w:ascii="Consolas" w:cs="Consolas" w:eastAsia="Consolas" w:hAnsi="Consolas"/>
-          <w:sz w:val="19"/>
-          <w:szCs w:val="19"/>
-        </w:rPr>
-        <w:t xml:space="preserve">http://localhost:5000/api/tinh-toan?hinh=HINH_THOI&amp;d1=6&amp;d2=8</w:t>
-      </w:r>
-    </w:p>
-    <w:p>
-      <w:pPr>
-        <w:spacing w:after="80"/>
-      </w:pPr>
+        <w:t xml:space="preserve">Tab Bài toán mẫu liệt kê 10 bài toán kèm kết luận do hệ thống tự giải. Bấm “Xem lời giải” để mở bài đó ở trang Nhận dạng với giả thiết đã được chọn sẵn.</w:t>
+      </w:r>
     </w:p>
     <w:p>
       <w:pPr>
@@ -3643,9 +3927,9 @@
       <w:r>
         <w:drawing>
           <wp:inline distT="0" distB="0" distL="0" distR="0">
-            <wp:extent cx="4286250" cy="5715000"/>
+            <wp:extent cx="5715000" cy="3810000"/>
             <wp:effectExtent t="0" r="0" b="0" l="0"/>
-            <wp:docPr id="1" name="11_api_json.png" descr="Kết quả API dạng JSON" title="Kết quả API dạng JSON"/>
+            <wp:docPr id="1" name="08_bai_toan_mau.png" descr="Trang Bài toán mẫu" title="Trang Bài toán mẫu"/>
             <wp:cNvGraphicFramePr>
               <a:graphicFrameLocks xmlns:a="http://schemas.openxmlformats.org/drawingml/2006/main" noChangeAspect="1"/>
             </wp:cNvGraphicFramePr>
@@ -3668,6 +3952,704 @@
                   <pic:spPr bwMode="auto">
                     <a:xfrm>
                       <a:off x="0" y="0"/>
+                      <a:ext cx="5715000" cy="3810000"/>
+                    </a:xfrm>
+                    <a:prstGeom prst="rect">
+                      <a:avLst/>
+                    </a:prstGeom>
+                  </pic:spPr>
+                </pic:pic>
+              </a:graphicData>
+            </a:graphic>
+          </wp:inline>
+        </w:drawing>
+      </w:r>
+    </w:p>
+    <w:p>
+      <w:pPr>
+        <w:spacing w:after="200"/>
+        <w:jc w:val="center"/>
+      </w:pPr>
+      <w:r>
+        <w:rPr>
+          <w:rFonts w:ascii="Times New Roman" w:cs="Times New Roman" w:eastAsia="Times New Roman" w:hAnsi="Times New Roman"/>
+          <w:i/>
+          <w:iCs/>
+          <w:sz w:val="22"/>
+          <w:szCs w:val="22"/>
+        </w:rPr>
+        <w:t xml:space="preserve">Hình 16. Trang Bài toán mẫu</w:t>
+      </w:r>
+    </w:p>
+    <w:p>
+      <w:pPr>
+        <w:pStyle w:val="Heading1"/>
+        <w:spacing w:after="160" w:before="360"/>
+      </w:pPr>
+      <w:r>
+        <w:rPr>
+          <w:rFonts w:ascii="Times New Roman" w:cs="Times New Roman" w:eastAsia="Times New Roman" w:hAnsi="Times New Roman"/>
+        </w:rPr>
+        <w:t xml:space="preserve">7. Đồ thị tri thức và tra cứu</w:t>
+      </w:r>
+    </w:p>
+    <w:p>
+      <w:pPr>
+        <w:spacing w:after="120" w:line="312"/>
+        <w:jc w:val="both"/>
+      </w:pPr>
+      <w:r>
+        <w:rPr>
+          <w:rFonts w:ascii="Times New Roman" w:cs="Times New Roman" w:eastAsia="Times New Roman" w:hAnsi="Times New Roman"/>
+          <w:sz w:val="26"/>
+          <w:szCs w:val="26"/>
+        </w:rPr>
+        <w:t xml:space="preserve">Tab Đồ thị tri thức cho biết số nút và số quan hệ đang có trong Neo4j, sơ đồ phân cấp, lược đồ đồ thị, bảng toàn bộ dấu hiệu nhận biết và các câu truy vấn mẫu để chạy trong Neo4j Browser.</w:t>
+      </w:r>
+    </w:p>
+    <w:p>
+      <w:pPr>
+        <w:spacing w:after="60" w:before="120"/>
+        <w:jc w:val="center"/>
+      </w:pPr>
+      <w:r>
+        <w:drawing>
+          <wp:inline distT="0" distB="0" distL="0" distR="0">
+            <wp:extent cx="5715000" cy="4648200"/>
+            <wp:effectExtent t="0" r="0" b="0" l="0"/>
+            <wp:docPr id="1" name="09a_do_thi_so_do.png" descr="Thống kê đồ thị và sơ đồ phân cấp" title="Thống kê đồ thị và sơ đồ phân cấp"/>
+            <wp:cNvGraphicFramePr>
+              <a:graphicFrameLocks xmlns:a="http://schemas.openxmlformats.org/drawingml/2006/main" noChangeAspect="1"/>
+            </wp:cNvGraphicFramePr>
+            <a:graphic xmlns:a="http://schemas.openxmlformats.org/drawingml/2006/main">
+              <a:graphicData uri="http://schemas.openxmlformats.org/drawingml/2006/picture">
+                <pic:pic xmlns:pic="http://schemas.openxmlformats.org/drawingml/2006/picture">
+                  <pic:nvPicPr>
+                    <pic:cNvPr id="0" name="" descr=""/>
+                    <pic:cNvPicPr>
+                      <a:picLocks noChangeAspect="1" noChangeArrowheads="1"/>
+                    </pic:cNvPicPr>
+                  </pic:nvPicPr>
+                  <pic:blipFill>
+                    <a:blip r:embed="rId24" cstate="none"/>
+                    <a:srcRect/>
+                    <a:stretch>
+                      <a:fillRect/>
+                    </a:stretch>
+                  </pic:blipFill>
+                  <pic:spPr bwMode="auto">
+                    <a:xfrm>
+                      <a:off x="0" y="0"/>
+                      <a:ext cx="5715000" cy="4648200"/>
+                    </a:xfrm>
+                    <a:prstGeom prst="rect">
+                      <a:avLst/>
+                    </a:prstGeom>
+                  </pic:spPr>
+                </pic:pic>
+              </a:graphicData>
+            </a:graphic>
+          </wp:inline>
+        </w:drawing>
+      </w:r>
+    </w:p>
+    <w:p>
+      <w:pPr>
+        <w:spacing w:after="200"/>
+        <w:jc w:val="center"/>
+      </w:pPr>
+      <w:r>
+        <w:rPr>
+          <w:rFonts w:ascii="Times New Roman" w:cs="Times New Roman" w:eastAsia="Times New Roman" w:hAnsi="Times New Roman"/>
+          <w:i/>
+          <w:iCs/>
+          <w:sz w:val="22"/>
+          <w:szCs w:val="22"/>
+        </w:rPr>
+        <w:t xml:space="preserve">Hình 17. Thống kê đồ thị và sơ đồ phân cấp</w:t>
+      </w:r>
+    </w:p>
+    <w:p>
+      <w:pPr>
+        <w:spacing w:after="60" w:before="120"/>
+        <w:jc w:val="center"/>
+      </w:pPr>
+      <w:r>
+        <w:drawing>
+          <wp:inline distT="0" distB="0" distL="0" distR="0">
+            <wp:extent cx="3800475" cy="7620000"/>
+            <wp:effectExtent t="0" r="0" b="0" l="0"/>
+            <wp:docPr id="1" name="09b_do_thi_dau_hieu.png" descr="Bảng dấu hiệu nhận biết và truy vấn mẫu" title="Bảng dấu hiệu nhận biết và truy vấn mẫu"/>
+            <wp:cNvGraphicFramePr>
+              <a:graphicFrameLocks xmlns:a="http://schemas.openxmlformats.org/drawingml/2006/main" noChangeAspect="1"/>
+            </wp:cNvGraphicFramePr>
+            <a:graphic xmlns:a="http://schemas.openxmlformats.org/drawingml/2006/main">
+              <a:graphicData uri="http://schemas.openxmlformats.org/drawingml/2006/picture">
+                <pic:pic xmlns:pic="http://schemas.openxmlformats.org/drawingml/2006/picture">
+                  <pic:nvPicPr>
+                    <pic:cNvPr id="0" name="" descr=""/>
+                    <pic:cNvPicPr>
+                      <a:picLocks noChangeAspect="1" noChangeArrowheads="1"/>
+                    </pic:cNvPicPr>
+                  </pic:nvPicPr>
+                  <pic:blipFill>
+                    <a:blip r:embed="rId25" cstate="none"/>
+                    <a:srcRect/>
+                    <a:stretch>
+                      <a:fillRect/>
+                    </a:stretch>
+                  </pic:blipFill>
+                  <pic:spPr bwMode="auto">
+                    <a:xfrm>
+                      <a:off x="0" y="0"/>
+                      <a:ext cx="3800475" cy="7620000"/>
+                    </a:xfrm>
+                    <a:prstGeom prst="rect">
+                      <a:avLst/>
+                    </a:prstGeom>
+                  </pic:spPr>
+                </pic:pic>
+              </a:graphicData>
+            </a:graphic>
+          </wp:inline>
+        </w:drawing>
+      </w:r>
+    </w:p>
+    <w:p>
+      <w:pPr>
+        <w:spacing w:after="200"/>
+        <w:jc w:val="center"/>
+      </w:pPr>
+      <w:r>
+        <w:rPr>
+          <w:rFonts w:ascii="Times New Roman" w:cs="Times New Roman" w:eastAsia="Times New Roman" w:hAnsi="Times New Roman"/>
+          <w:i/>
+          <w:iCs/>
+          <w:sz w:val="22"/>
+          <w:szCs w:val="22"/>
+        </w:rPr>
+        <w:t xml:space="preserve">Hình 18. Bảng dấu hiệu nhận biết và truy vấn mẫu</w:t>
+      </w:r>
+    </w:p>
+    <w:p>
+      <w:pPr>
+        <w:spacing w:after="120" w:line="312"/>
+        <w:jc w:val="both"/>
+      </w:pPr>
+      <w:r>
+        <w:rPr>
+          <w:rFonts w:ascii="Times New Roman" w:cs="Times New Roman" w:eastAsia="Times New Roman" w:hAnsi="Times New Roman"/>
+          <w:sz w:val="26"/>
+          <w:szCs w:val="26"/>
+        </w:rPr>
+        <w:t xml:space="preserve">Bấm vào một hình trên sơ đồ để mở trang tra cứu hình đó. Trang tra cứu có định nghĩa, hình cha và hình con, các dấu hiệu nhận biết, những hình có thể suy ra tiếp, toàn bộ tính chất (tính chất riêng được in đậm, còn lại ghi rõ kế thừa từ hình nào) và bảng công thức kèm hình vẽ minh hoạ.</w:t>
+      </w:r>
+    </w:p>
+    <w:p>
+      <w:pPr>
+        <w:spacing w:after="60" w:before="120"/>
+        <w:jc w:val="center"/>
+      </w:pPr>
+      <w:r>
+        <w:drawing>
+          <wp:inline distT="0" distB="0" distL="0" distR="0">
+            <wp:extent cx="4438650" cy="6667500"/>
+            <wp:effectExtent t="0" r="0" b="0" l="0"/>
+            <wp:docPr id="1" name="10_tra_cuu_hinh_vuong.png" descr="Trang tra cứu Hình vuông" title="Trang tra cứu Hình vuông"/>
+            <wp:cNvGraphicFramePr>
+              <a:graphicFrameLocks xmlns:a="http://schemas.openxmlformats.org/drawingml/2006/main" noChangeAspect="1"/>
+            </wp:cNvGraphicFramePr>
+            <a:graphic xmlns:a="http://schemas.openxmlformats.org/drawingml/2006/main">
+              <a:graphicData uri="http://schemas.openxmlformats.org/drawingml/2006/picture">
+                <pic:pic xmlns:pic="http://schemas.openxmlformats.org/drawingml/2006/picture">
+                  <pic:nvPicPr>
+                    <pic:cNvPr id="0" name="" descr=""/>
+                    <pic:cNvPicPr>
+                      <a:picLocks noChangeAspect="1" noChangeArrowheads="1"/>
+                    </pic:cNvPicPr>
+                  </pic:nvPicPr>
+                  <pic:blipFill>
+                    <a:blip r:embed="rId26" cstate="none"/>
+                    <a:srcRect/>
+                    <a:stretch>
+                      <a:fillRect/>
+                    </a:stretch>
+                  </pic:blipFill>
+                  <pic:spPr bwMode="auto">
+                    <a:xfrm>
+                      <a:off x="0" y="0"/>
+                      <a:ext cx="4438650" cy="6667500"/>
+                    </a:xfrm>
+                    <a:prstGeom prst="rect">
+                      <a:avLst/>
+                    </a:prstGeom>
+                  </pic:spPr>
+                </pic:pic>
+              </a:graphicData>
+            </a:graphic>
+          </wp:inline>
+        </w:drawing>
+      </w:r>
+    </w:p>
+    <w:p>
+      <w:pPr>
+        <w:spacing w:after="200"/>
+        <w:jc w:val="center"/>
+      </w:pPr>
+      <w:r>
+        <w:rPr>
+          <w:rFonts w:ascii="Times New Roman" w:cs="Times New Roman" w:eastAsia="Times New Roman" w:hAnsi="Times New Roman"/>
+          <w:i/>
+          <w:iCs/>
+          <w:sz w:val="22"/>
+          <w:szCs w:val="22"/>
+        </w:rPr>
+        <w:t xml:space="preserve">Hình 19. Trang tra cứu Hình vuông</w:t>
+      </w:r>
+    </w:p>
+    <w:p>
+      <w:pPr>
+        <w:pStyle w:val="Heading1"/>
+        <w:spacing w:after="160" w:before="360"/>
+      </w:pPr>
+      <w:r>
+        <w:rPr>
+          <w:rFonts w:ascii="Times New Roman" w:cs="Times New Roman" w:eastAsia="Times New Roman" w:hAnsi="Times New Roman"/>
+        </w:rPr>
+        <w:t xml:space="preserve">8. Dùng trực tiếp trong Neo4j Browser và qua API</w:t>
+      </w:r>
+    </w:p>
+    <w:p>
+      <w:pPr>
+        <w:pStyle w:val="Heading2"/>
+        <w:spacing w:after="120" w:before="240"/>
+      </w:pPr>
+      <w:r>
+        <w:rPr>
+          <w:rFonts w:ascii="Times New Roman" w:cs="Times New Roman" w:eastAsia="Times New Roman" w:hAnsi="Times New Roman"/>
+        </w:rPr>
+        <w:t xml:space="preserve">8.1. Neo4j Browser</w:t>
+      </w:r>
+    </w:p>
+    <w:p>
+      <w:pPr>
+        <w:spacing w:after="120" w:line="312"/>
+        <w:jc w:val="both"/>
+      </w:pPr>
+      <w:r>
+        <w:rPr>
+          <w:rFonts w:ascii="Times New Roman" w:cs="Times New Roman" w:eastAsia="Times New Roman" w:hAnsi="Times New Roman"/>
+          <w:sz w:val="26"/>
+          <w:szCs w:val="26"/>
+        </w:rPr>
+        <w:t xml:space="preserve">Mở </w:t>
+      </w:r>
+      <w:r>
+        <w:rPr>
+          <w:rFonts w:ascii="Times New Roman" w:cs="Times New Roman" w:eastAsia="Times New Roman" w:hAnsi="Times New Roman"/>
+          <w:b/>
+          <w:bCs/>
+          <w:sz w:val="26"/>
+          <w:szCs w:val="26"/>
+        </w:rPr>
+        <w:t xml:space="preserve">http://localhost:7474</w:t>
+      </w:r>
+      <w:r>
+        <w:rPr>
+          <w:rFonts w:ascii="Times New Roman" w:cs="Times New Roman" w:eastAsia="Times New Roman" w:hAnsi="Times New Roman"/>
+          <w:sz w:val="26"/>
+          <w:szCs w:val="26"/>
+        </w:rPr>
+        <w:t xml:space="preserve"> và đăng nhập bằng neo4j / matkhau123. Gõ câu lệnh vào ô ở trên cùng rồi nhấn Ctrl + Enter. Ví dụ, xem sơ đồ phân cấp:</w:t>
+      </w:r>
+    </w:p>
+    <w:p>
+      <w:pPr>
+        <w:pBdr>
+          <w:top w:val="single" w:color="D0D5DD" w:sz="4" w:space="4"/>
+        </w:pBdr>
+        <w:shd w:fill="F2F4F7" w:color="auto" w:val="clear"/>
+        <w:spacing w:after="0" w:before="0" w:line="260"/>
+        <w:ind w:left="200" w:right="200"/>
+      </w:pPr>
+      <w:r>
+        <w:rPr>
+          <w:rFonts w:ascii="Consolas" w:cs="Consolas" w:eastAsia="Consolas" w:hAnsi="Consolas"/>
+          <w:sz w:val="19"/>
+          <w:szCs w:val="19"/>
+        </w:rPr>
+        <w:t xml:space="preserve">MATCH p = (:Hinh)-[:LA_MOT]-&gt;(:Hinh) RETURN p</w:t>
+      </w:r>
+    </w:p>
+    <w:p>
+      <w:pPr>
+        <w:spacing w:after="80"/>
+      </w:pPr>
+    </w:p>
+    <w:p>
+      <w:pPr>
+        <w:spacing w:after="120" w:line="312"/>
+        <w:jc w:val="both"/>
+      </w:pPr>
+      <w:r>
+        <w:rPr>
+          <w:rFonts w:ascii="Times New Roman" w:cs="Times New Roman" w:eastAsia="Times New Roman" w:hAnsi="Times New Roman"/>
+          <w:sz w:val="26"/>
+          <w:szCs w:val="26"/>
+        </w:rPr>
+        <w:t xml:space="preserve">Các dấu hiệu dẫn tới hình vuông:</w:t>
+      </w:r>
+    </w:p>
+    <w:p>
+      <w:pPr>
+        <w:pBdr>
+          <w:top w:val="single" w:color="D0D5DD" w:sz="4" w:space="4"/>
+        </w:pBdr>
+        <w:shd w:fill="F2F4F7" w:color="auto" w:val="clear"/>
+        <w:spacing w:after="0" w:before="0" w:line="260"/>
+        <w:ind w:left="200" w:right="200"/>
+      </w:pPr>
+      <w:r>
+        <w:rPr>
+          <w:rFonts w:ascii="Consolas" w:cs="Consolas" w:eastAsia="Consolas" w:hAnsi="Consolas"/>
+          <w:sz w:val="19"/>
+          <w:szCs w:val="19"/>
+        </w:rPr>
+        <w:t xml:space="preserve">MATCH p = (:Hinh)&lt;-[:AP_DUNG_CHO]-(d:DauHieu)-[:KET_LUAN]-&gt;(:Hinh {ma:'HINH_VUONG'})</w:t>
+      </w:r>
+    </w:p>
+    <w:p>
+      <w:pPr>
+        <w:shd w:fill="F2F4F7" w:color="auto" w:val="clear"/>
+        <w:spacing w:after="0" w:before="0" w:line="260"/>
+        <w:ind w:left="200" w:right="200"/>
+      </w:pPr>
+      <w:r>
+        <w:rPr>
+          <w:rFonts w:ascii="Consolas" w:cs="Consolas" w:eastAsia="Consolas" w:hAnsi="Consolas"/>
+          <w:sz w:val="19"/>
+          <w:szCs w:val="19"/>
+        </w:rPr>
+        <w:t xml:space="preserve">OPTIONAL MATCH q = (d)-[:CAN]-&gt;(:TinhChat)</w:t>
+      </w:r>
+    </w:p>
+    <w:p>
+      <w:pPr>
+        <w:pBdr>
+          <w:bottom w:val="single" w:color="D0D5DD" w:sz="4" w:space="4"/>
+        </w:pBdr>
+        <w:shd w:fill="F2F4F7" w:color="auto" w:val="clear"/>
+        <w:spacing w:after="0" w:before="0" w:line="260"/>
+        <w:ind w:left="200" w:right="200"/>
+      </w:pPr>
+      <w:r>
+        <w:rPr>
+          <w:rFonts w:ascii="Consolas" w:cs="Consolas" w:eastAsia="Consolas" w:hAnsi="Consolas"/>
+          <w:sz w:val="19"/>
+          <w:szCs w:val="19"/>
+        </w:rPr>
+        <w:t xml:space="preserve">RETURN p, q</w:t>
+      </w:r>
+    </w:p>
+    <w:p>
+      <w:pPr>
+        <w:spacing w:after="80"/>
+      </w:pPr>
+    </w:p>
+    <w:p>
+      <w:pPr>
+        <w:spacing w:after="120" w:line="312"/>
+        <w:jc w:val="both"/>
+      </w:pPr>
+      <w:r>
+        <w:rPr>
+          <w:rFonts w:ascii="Times New Roman" w:cs="Times New Roman" w:eastAsia="Times New Roman" w:hAnsi="Times New Roman"/>
+          <w:sz w:val="26"/>
+          <w:szCs w:val="26"/>
+        </w:rPr>
+        <w:t xml:space="preserve">Mọi tính chất của hình chữ nhật, kể cả tính chất kế thừa:</w:t>
+      </w:r>
+    </w:p>
+    <w:p>
+      <w:pPr>
+        <w:pBdr>
+          <w:top w:val="single" w:color="D0D5DD" w:sz="4" w:space="4"/>
+        </w:pBdr>
+        <w:shd w:fill="F2F4F7" w:color="auto" w:val="clear"/>
+        <w:spacing w:after="0" w:before="0" w:line="260"/>
+        <w:ind w:left="200" w:right="200"/>
+      </w:pPr>
+      <w:r>
+        <w:rPr>
+          <w:rFonts w:ascii="Consolas" w:cs="Consolas" w:eastAsia="Consolas" w:hAnsi="Consolas"/>
+          <w:sz w:val="19"/>
+          <w:szCs w:val="19"/>
+        </w:rPr>
+        <w:t xml:space="preserve">MATCH (:Hinh {ma:'HINH_CHU_NHAT'})-[:LA_MOT*0..]-&gt;(a)-[:CO_TINH_CHAT]-&gt;(t)</w:t>
+      </w:r>
+    </w:p>
+    <w:p>
+      <w:pPr>
+        <w:pBdr>
+          <w:bottom w:val="single" w:color="D0D5DD" w:sz="4" w:space="4"/>
+        </w:pBdr>
+        <w:shd w:fill="F2F4F7" w:color="auto" w:val="clear"/>
+        <w:spacing w:after="0" w:before="0" w:line="260"/>
+        <w:ind w:left="200" w:right="200"/>
+      </w:pPr>
+      <w:r>
+        <w:rPr>
+          <w:rFonts w:ascii="Consolas" w:cs="Consolas" w:eastAsia="Consolas" w:hAnsi="Consolas"/>
+          <w:sz w:val="19"/>
+          <w:szCs w:val="19"/>
+        </w:rPr>
+        <w:t xml:space="preserve">RETURN t.ten AS tinh_chat, collect(DISTINCT a.ten) AS ke_thua_tu</w:t>
+      </w:r>
+    </w:p>
+    <w:p>
+      <w:pPr>
+        <w:spacing w:after="80"/>
+      </w:pPr>
+    </w:p>
+    <w:p>
+      <w:pPr>
+        <w:spacing w:after="120" w:line="312"/>
+        <w:jc w:val="both"/>
+      </w:pPr>
+      <w:r>
+        <w:rPr>
+          <w:rFonts w:ascii="Times New Roman" w:cs="Times New Roman" w:eastAsia="Times New Roman" w:hAnsi="Times New Roman"/>
+          <w:sz w:val="26"/>
+          <w:szCs w:val="26"/>
+        </w:rPr>
+        <w:t xml:space="preserve">Công thức diện tích và chu vi của mọi hình:</w:t>
+      </w:r>
+    </w:p>
+    <w:p>
+      <w:pPr>
+        <w:pBdr>
+          <w:top w:val="single" w:color="D0D5DD" w:sz="4" w:space="4"/>
+        </w:pBdr>
+        <w:shd w:fill="F2F4F7" w:color="auto" w:val="clear"/>
+        <w:spacing w:after="0" w:before="0" w:line="260"/>
+        <w:ind w:left="200" w:right="200"/>
+      </w:pPr>
+      <w:r>
+        <w:rPr>
+          <w:rFonts w:ascii="Consolas" w:cs="Consolas" w:eastAsia="Consolas" w:hAnsi="Consolas"/>
+          <w:sz w:val="19"/>
+          <w:szCs w:val="19"/>
+        </w:rPr>
+        <w:t xml:space="preserve">MATCH (h:Hinh)-[:CO_CONG_THUC]-&gt;(c:CongThuc)</w:t>
+      </w:r>
+    </w:p>
+    <w:p>
+      <w:pPr>
+        <w:shd w:fill="F2F4F7" w:color="auto" w:val="clear"/>
+        <w:spacing w:after="0" w:before="0" w:line="260"/>
+        <w:ind w:left="200" w:right="200"/>
+      </w:pPr>
+      <w:r>
+        <w:rPr>
+          <w:rFonts w:ascii="Consolas" w:cs="Consolas" w:eastAsia="Consolas" w:hAnsi="Consolas"/>
+          <w:sz w:val="19"/>
+          <w:szCs w:val="19"/>
+        </w:rPr>
+        <w:t xml:space="preserve">WHERE c.loai IN ['dien_tich', 'chu_vi']</w:t>
+      </w:r>
+    </w:p>
+    <w:p>
+      <w:pPr>
+        <w:pBdr>
+          <w:bottom w:val="single" w:color="D0D5DD" w:sz="4" w:space="4"/>
+        </w:pBdr>
+        <w:shd w:fill="F2F4F7" w:color="auto" w:val="clear"/>
+        <w:spacing w:after="0" w:before="0" w:line="260"/>
+        <w:ind w:left="200" w:right="200"/>
+      </w:pPr>
+      <w:r>
+        <w:rPr>
+          <w:rFonts w:ascii="Consolas" w:cs="Consolas" w:eastAsia="Consolas" w:hAnsi="Consolas"/>
+          <w:sz w:val="19"/>
+          <w:szCs w:val="19"/>
+        </w:rPr>
+        <w:t xml:space="preserve">RETURN h.ten AS hinh, c.loai_ten AS loai, c.hien_thi AS cong_thuc</w:t>
+      </w:r>
+    </w:p>
+    <w:p>
+      <w:pPr>
+        <w:spacing w:after="80"/>
+      </w:pPr>
+    </w:p>
+    <w:p>
+      <w:pPr>
+        <w:spacing w:after="120" w:line="312"/>
+        <w:jc w:val="both"/>
+      </w:pPr>
+      <w:r>
+        <w:rPr>
+          <w:rFonts w:ascii="Times New Roman" w:cs="Times New Roman" w:eastAsia="Times New Roman" w:hAnsi="Times New Roman"/>
+          <w:sz w:val="26"/>
+          <w:szCs w:val="26"/>
+        </w:rPr>
+        <w:t xml:space="preserve">Đồ thị công thức của hình chữ nhật:</w:t>
+      </w:r>
+    </w:p>
+    <w:p>
+      <w:pPr>
+        <w:pBdr>
+          <w:top w:val="single" w:color="D0D5DD" w:sz="4" w:space="4"/>
+        </w:pBdr>
+        <w:shd w:fill="F2F4F7" w:color="auto" w:val="clear"/>
+        <w:spacing w:after="0" w:before="0" w:line="260"/>
+        <w:ind w:left="200" w:right="200"/>
+      </w:pPr>
+      <w:r>
+        <w:rPr>
+          <w:rFonts w:ascii="Consolas" w:cs="Consolas" w:eastAsia="Consolas" w:hAnsi="Consolas"/>
+          <w:sz w:val="19"/>
+          <w:szCs w:val="19"/>
+        </w:rPr>
+        <w:t xml:space="preserve">MATCH p = (:Hinh {ma:'HINH_CHU_NHAT'})-[:CO_CONG_THUC]-&gt;(:CongThuc)-[:TINH_RA|CAN_BIEN]-&gt;(:DaiLuong)</w:t>
+      </w:r>
+    </w:p>
+    <w:p>
+      <w:pPr>
+        <w:pBdr>
+          <w:bottom w:val="single" w:color="D0D5DD" w:sz="4" w:space="4"/>
+        </w:pBdr>
+        <w:shd w:fill="F2F4F7" w:color="auto" w:val="clear"/>
+        <w:spacing w:after="0" w:before="0" w:line="260"/>
+        <w:ind w:left="200" w:right="200"/>
+      </w:pPr>
+      <w:r>
+        <w:rPr>
+          <w:rFonts w:ascii="Consolas" w:cs="Consolas" w:eastAsia="Consolas" w:hAnsi="Consolas"/>
+          <w:sz w:val="19"/>
+          <w:szCs w:val="19"/>
+        </w:rPr>
+        <w:t xml:space="preserve">RETURN p</w:t>
+      </w:r>
+    </w:p>
+    <w:p>
+      <w:pPr>
+        <w:spacing w:after="80"/>
+      </w:pPr>
+    </w:p>
+    <w:p>
+      <w:pPr>
+        <w:spacing w:after="120" w:line="312"/>
+        <w:jc w:val="both"/>
+      </w:pPr>
+      <w:r>
+        <w:rPr>
+          <w:rFonts w:ascii="Times New Roman" w:cs="Times New Roman" w:eastAsia="Times New Roman" w:hAnsi="Times New Roman"/>
+          <w:sz w:val="26"/>
+          <w:szCs w:val="26"/>
+        </w:rPr>
+        <w:t xml:space="preserve">Thêm nhiều truy vấn khác có trong file cypher\queries.cypher. Nếu không muốn dùng Python, có thể tạo toàn bộ đồ thị bằng cách dán file cypher\seed.cypher vào Neo4j Browser. Trước đó cần bật “Enable multi statement query editor” trong phần Settings của Neo4j Browser.</w:t>
+      </w:r>
+    </w:p>
+    <w:p>
+      <w:pPr>
+        <w:pStyle w:val="Heading2"/>
+        <w:spacing w:after="120" w:before="240"/>
+      </w:pPr>
+      <w:r>
+        <w:rPr>
+          <w:rFonts w:ascii="Times New Roman" w:cs="Times New Roman" w:eastAsia="Times New Roman" w:hAnsi="Times New Roman"/>
+        </w:rPr>
+        <w:t xml:space="preserve">8.2. API JSON</w:t>
+      </w:r>
+    </w:p>
+    <w:p>
+      <w:pPr>
+        <w:spacing w:after="120" w:line="312"/>
+        <w:jc w:val="both"/>
+      </w:pPr>
+      <w:r>
+        <w:rPr>
+          <w:rFonts w:ascii="Times New Roman" w:cs="Times New Roman" w:eastAsia="Times New Roman" w:hAnsi="Times New Roman"/>
+          <w:sz w:val="26"/>
+          <w:szCs w:val="26"/>
+        </w:rPr>
+        <w:t xml:space="preserve">Ứng dụng có thêm API để chương trình khác gọi tới. Ví dụ nhận dạng và tính toán:</w:t>
+      </w:r>
+    </w:p>
+    <w:p>
+      <w:pPr>
+        <w:pBdr>
+          <w:top w:val="single" w:color="D0D5DD" w:sz="4" w:space="4"/>
+        </w:pBdr>
+        <w:shd w:fill="F2F4F7" w:color="auto" w:val="clear"/>
+        <w:spacing w:after="0" w:before="0" w:line="260"/>
+        <w:ind w:left="200" w:right="200"/>
+      </w:pPr>
+      <w:r>
+        <w:rPr>
+          <w:rFonts w:ascii="Consolas" w:cs="Consolas" w:eastAsia="Consolas" w:hAnsi="Consolas"/>
+          <w:sz w:val="19"/>
+          <w:szCs w:val="19"/>
+        </w:rPr>
+        <w:t xml:space="preserve">http://localhost:5000/api/suy-luan?hinh=HINH_BINH_HANH&amp;tc=CHEO_VUONG_GOC&amp;tc=CHEO_BANG</w:t>
+      </w:r>
+    </w:p>
+    <w:p>
+      <w:pPr>
+        <w:pBdr>
+          <w:bottom w:val="single" w:color="D0D5DD" w:sz="4" w:space="4"/>
+        </w:pBdr>
+        <w:shd w:fill="F2F4F7" w:color="auto" w:val="clear"/>
+        <w:spacing w:after="0" w:before="0" w:line="260"/>
+        <w:ind w:left="200" w:right="200"/>
+      </w:pPr>
+      <w:r>
+        <w:rPr>
+          <w:rFonts w:ascii="Consolas" w:cs="Consolas" w:eastAsia="Consolas" w:hAnsi="Consolas"/>
+          <w:sz w:val="19"/>
+          <w:szCs w:val="19"/>
+        </w:rPr>
+        <w:t xml:space="preserve">http://localhost:5000/api/tinh-toan?hinh=HINH_THOI&amp;d1=6&amp;d2=8</w:t>
+      </w:r>
+    </w:p>
+    <w:p>
+      <w:pPr>
+        <w:spacing w:after="80"/>
+      </w:pPr>
+    </w:p>
+    <w:p>
+      <w:pPr>
+        <w:spacing w:after="60" w:before="120"/>
+        <w:jc w:val="center"/>
+      </w:pPr>
+      <w:r>
+        <w:drawing>
+          <wp:inline distT="0" distB="0" distL="0" distR="0">
+            <wp:extent cx="4286250" cy="5715000"/>
+            <wp:effectExtent t="0" r="0" b="0" l="0"/>
+            <wp:docPr id="1" name="11_api_json.png" descr="Kết quả API dạng JSON" title="Kết quả API dạng JSON"/>
+            <wp:cNvGraphicFramePr>
+              <a:graphicFrameLocks xmlns:a="http://schemas.openxmlformats.org/drawingml/2006/main" noChangeAspect="1"/>
+            </wp:cNvGraphicFramePr>
+            <a:graphic xmlns:a="http://schemas.openxmlformats.org/drawingml/2006/main">
+              <a:graphicData uri="http://schemas.openxmlformats.org/drawingml/2006/picture">
+                <pic:pic xmlns:pic="http://schemas.openxmlformats.org/drawingml/2006/picture">
+                  <pic:nvPicPr>
+                    <pic:cNvPr id="0" name="" descr=""/>
+                    <pic:cNvPicPr>
+                      <a:picLocks noChangeAspect="1" noChangeArrowheads="1"/>
+                    </pic:cNvPicPr>
+                  </pic:nvPicPr>
+                  <pic:blipFill>
+                    <a:blip r:embed="rId27" cstate="none"/>
+                    <a:srcRect/>
+                    <a:stretch>
+                      <a:fillRect/>
+                    </a:stretch>
+                  </pic:blipFill>
+                  <pic:spPr bwMode="auto">
+                    <a:xfrm>
+                      <a:off x="0" y="0"/>
                       <a:ext cx="4286250" cy="5715000"/>
                     </a:xfrm>
                     <a:prstGeom prst="rect">
@@ -3694,7 +4676,7 @@
           <w:sz w:val="22"/>
           <w:szCs w:val="22"/>
         </w:rPr>
-        <w:t xml:space="preserve">Hình 16. Kết quả API dạng JSON</w:t>
+        <w:t xml:space="preserve">Hình 20. Kết quả API dạng JSON</w:t>
       </w:r>
     </w:p>
     <w:p>
@@ -3706,7 +4688,7 @@
         <w:rPr>
           <w:rFonts w:ascii="Times New Roman" w:cs="Times New Roman" w:eastAsia="Times New Roman" w:hAnsi="Times New Roman"/>
         </w:rPr>
-        <w:t xml:space="preserve">8. Đưa mã nguồn lên GitHub</w:t>
+        <w:t xml:space="preserve">9. Đưa mã nguồn lên GitHub</w:t>
       </w:r>
     </w:p>
     <w:p>
@@ -3714,7 +4696,7 @@
         <w:pStyle w:val="ListParagraph"/>
         <w:numPr>
           <w:ilvl w:val="0"/>
-          <w:numId w:val="4"/>
+          <w:numId w:val="5"/>
         </w:numPr>
         <w:spacing w:after="60" w:line="300"/>
       </w:pPr>
@@ -3732,7 +4714,7 @@
         <w:pStyle w:val="ListParagraph"/>
         <w:numPr>
           <w:ilvl w:val="0"/>
-          <w:numId w:val="4"/>
+          <w:numId w:val="5"/>
         </w:numPr>
         <w:spacing w:after="60" w:line="300"/>
       </w:pPr>
@@ -3750,7 +4732,7 @@
         <w:pStyle w:val="ListParagraph"/>
         <w:numPr>
           <w:ilvl w:val="0"/>
-          <w:numId w:val="4"/>
+          <w:numId w:val="5"/>
         </w:numPr>
         <w:spacing w:after="60" w:line="300"/>
       </w:pPr>
@@ -3882,7 +4864,7 @@
         <w:rPr>
           <w:rFonts w:ascii="Times New Roman" w:cs="Times New Roman" w:eastAsia="Times New Roman" w:hAnsi="Times New Roman"/>
         </w:rPr>
-        <w:t xml:space="preserve">9. Xử lý lỗi thường gặp</w:t>
+        <w:t xml:space="preserve">10. Xử lý lỗi thường gặp</w:t>
       </w:r>
     </w:p>
     <w:tbl>
@@ -4397,6 +5379,72 @@
                 <w:sz w:val="22"/>
                 <w:szCs w:val="22"/>
               </w:rPr>
+              <w:t xml:space="preserve">Trang Thử thách báo “Tứ giác bị lõm hoặc tự cắt”</w:t>
+            </w:r>
+          </w:p>
+        </w:tc>
+        <w:tc>
+          <w:tcPr>
+            <w:tcW w:type="dxa" w:w="5261"/>
+            <w:tcBorders>
+              <w:top w:val="single" w:color="B8C0CC" w:sz="4"/>
+              <w:left w:val="single" w:color="B8C0CC" w:sz="4"/>
+              <w:bottom w:val="single" w:color="B8C0CC" w:sz="4"/>
+              <w:right w:val="single" w:color="B8C0CC" w:sz="4"/>
+            </w:tcBorders>
+            <w:tcMar>
+              <w:top w:type="dxa" w:w="60"/>
+              <w:left w:type="dxa" w:w="100"/>
+              <w:bottom w:type="dxa" w:w="60"/>
+              <w:right w:type="dxa" w:w="100"/>
+            </w:tcMar>
+          </w:tcPr>
+          <w:p>
+            <w:pPr>
+              <w:spacing w:after="0" w:line="276"/>
+            </w:pPr>
+            <w:r>
+              <w:rPr>
+                <w:rFonts w:ascii="Times New Roman" w:cs="Times New Roman" w:eastAsia="Times New Roman" w:hAnsi="Times New Roman"/>
+                <w:b w:val="false"/>
+                <w:bCs w:val="false"/>
+                <w:sz w:val="22"/>
+                <w:szCs w:val="22"/>
+              </w:rPr>
+              <w:t xml:space="preserve">Các đỉnh A, B, C, D phải đi vòng quanh hình theo đúng thứ tự. Kéo đỉnh vừa di chuyển ra ngoài để tứ giác lồi trở lại.</w:t>
+            </w:r>
+          </w:p>
+        </w:tc>
+      </w:tr>
+      <w:tr>
+        <w:tc>
+          <w:tcPr>
+            <w:tcW w:type="dxa" w:w="3810"/>
+            <w:tcBorders>
+              <w:top w:val="single" w:color="B8C0CC" w:sz="4"/>
+              <w:left w:val="single" w:color="B8C0CC" w:sz="4"/>
+              <w:bottom w:val="single" w:color="B8C0CC" w:sz="4"/>
+              <w:right w:val="single" w:color="B8C0CC" w:sz="4"/>
+            </w:tcBorders>
+            <w:tcMar>
+              <w:top w:type="dxa" w:w="60"/>
+              <w:left w:type="dxa" w:w="100"/>
+              <w:bottom w:type="dxa" w:w="60"/>
+              <w:right w:type="dxa" w:w="100"/>
+            </w:tcMar>
+          </w:tcPr>
+          <w:p>
+            <w:pPr>
+              <w:spacing w:after="0" w:line="276"/>
+            </w:pPr>
+            <w:r>
+              <w:rPr>
+                <w:rFonts w:ascii="Times New Roman" w:cs="Times New Roman" w:eastAsia="Times New Roman" w:hAnsi="Times New Roman"/>
+                <w:b w:val="false"/>
+                <w:bCs w:val="false"/>
+                <w:sz w:val="22"/>
+                <w:szCs w:val="22"/>
+              </w:rPr>
               <w:t xml:space="preserve">Trang Tính toán không có công thức / báo lỗi sau khi cập nhật mã nguồn</w:t>
             </w:r>
           </w:p>
@@ -4463,7 +5511,7 @@
           <w:sz w:val="26"/>
           <w:szCs w:val="26"/>
         </w:rPr>
-        <w:t xml:space="preserve">Chạy lệnh dưới để kiểm tra tri thức và bộ suy luận (không cần Neo4j). Kết quả đúng là “Ran 32 tests … OK”.</w:t>
+        <w:t xml:space="preserve">Chạy lệnh dưới để kiểm tra tri thức và bộ suy luận (không cần Neo4j). Kết quả đúng là “Ran 45 tests … OK”.</w:t>
       </w:r>
     </w:p>
     <w:p>
@@ -4809,6 +5857,12 @@
     </w:lvlOverride>
   </w:num>
   <w:num w:numId="4">
+    <w:abstractNumId w:val="8"/>
+    <w:lvlOverride w:ilvl="0">
+      <w:startOverride w:val="1"/>
+    </w:lvlOverride>
+  </w:num>
+  <w:num w:numId="5">
     <w:abstractNumId w:val="4"/>
     <w:lvlOverride w:ilvl="0">
       <w:startOverride w:val="1"/>

</xml_diff>

<commit_message>
Sua so do phan cap
</commit_message>
<xml_diff>
--- a/docs/2_Huong_dan_su_dung.docx
+++ b/docs/2_Huong_dan_su_dung.docx
@@ -1982,7 +1982,7 @@
           <w:sz w:val="26"/>
           <w:szCs w:val="26"/>
         </w:rPr>
-        <w:t xml:space="preserve">Kéo xuống dưới sẽ thấy sơ đồ phân cấp. Trên sơ đồ, hình ban đầu có viền xanh lá, các hình suy ra được tô xanh nhạt và hình kết luận tô xanh đậm. Bên dưới sơ đồ là danh sách mọi tính chất đã biết kèm nguồn gốc của từng tính chất.</w:t>
+        <w:t xml:space="preserve">Kéo xuống dưới sẽ thấy sơ đồ phân cấp: mỗi loại hình được vẽ bằng chính hình đó, mũi tên đi từ hình tổng quát xuống hình đặc biệt hơn. Hình ban đầu có viền xanh lá, các hình suy ra được tô xanh nhạt, hình kết luận có viền xanh đậm. Các bước suy luận được tô thành mũi tên xanh lá kèm mã dấu hiệu đã dùng (ví dụ DH14, DH20); bước nào đi tắt qua nhiều tầng thì mã dấu hiệu được ghi ở góc ô hình kết luận. Bên dưới sơ đồ là danh sách mọi tính chất đã biết kèm nguồn gốc của từng tính chất.</w:t>
       </w:r>
     </w:p>
     <w:p>
@@ -1993,7 +1993,7 @@
       <w:r>
         <w:drawing>
           <wp:inline distT="0" distB="0" distL="0" distR="0">
-            <wp:extent cx="4953000" cy="6438900"/>
+            <wp:extent cx="4467225" cy="6667500"/>
             <wp:effectExtent t="0" r="0" b="0" l="0"/>
             <wp:docPr id="1" name="03_hbh_so_do_tinh_chat.png" descr="Sơ đồ phân cấp được tô màu theo kết quả và danh sách tính chất đã biết" title="Sơ đồ phân cấp được tô màu theo kết quả và danh sách tính chất đã biết"/>
             <wp:cNvGraphicFramePr>
@@ -2018,7 +2018,7 @@
                   <pic:spPr bwMode="auto">
                     <a:xfrm>
                       <a:off x="0" y="0"/>
-                      <a:ext cx="4953000" cy="6438900"/>
+                      <a:ext cx="4467225" cy="6667500"/>
                     </a:xfrm>
                     <a:prstGeom prst="rect">
                       <a:avLst/>
@@ -4947,7 +4947,7 @@
           <w:sz w:val="26"/>
           <w:szCs w:val="26"/>
         </w:rPr>
-        <w:t xml:space="preserve">Bấm vào một hình trên sơ đồ để mở trang tra cứu hình đó. Trang tra cứu có định nghĩa, hình cha và hình con, các dấu hiệu nhận biết, những hình có thể suy ra tiếp, toàn bộ tính chất (tính chất riêng được in đậm, còn lại ghi rõ kế thừa từ hình nào) và bảng công thức kèm hình vẽ minh hoạ.</w:t>
+        <w:t xml:space="preserve">Bấm vào một hình trên sơ đồ để mở trang tra cứu hình đó. Trang tra cứu có định nghĩa, hình cha và hình con, các dấu hiệu nhận biết, những hình có thể suy ra tiếp, toàn bộ tính chất (tính chất riêng được in đậm, còn lại ghi rõ kế thừa từ hình nào), bảng công thức kèm hình vẽ minh hoạ, và cuối trang là vị trí của hình trong sơ đồ: hình đang xem có viền xanh đậm, các hình tổng quát hơn tô xanh nhạt, các hình đặc biệt hơn tô xanh lá.</w:t>
       </w:r>
     </w:p>
     <w:p>
@@ -4958,7 +4958,7 @@
       <w:r>
         <w:drawing>
           <wp:inline distT="0" distB="0" distL="0" distR="0">
-            <wp:extent cx="4438650" cy="6667500"/>
+            <wp:extent cx="4038600" cy="7239000"/>
             <wp:effectExtent t="0" r="0" b="0" l="0"/>
             <wp:docPr id="1" name="10_tra_cuu_hinh_vuong.png" descr="Trang tra cứu Hình vuông" title="Trang tra cứu Hình vuông"/>
             <wp:cNvGraphicFramePr>
@@ -4983,7 +4983,7 @@
                   <pic:spPr bwMode="auto">
                     <a:xfrm>
                       <a:off x="0" y="0"/>
-                      <a:ext cx="4438650" cy="6667500"/>
+                      <a:ext cx="4038600" cy="7239000"/>
                     </a:xfrm>
                     <a:prstGeom prst="rect">
                       <a:avLst/>

</xml_diff>